<commit_message>
vault backup: 2026-10-16 14:57:47
</commit_message>
<xml_diff>
--- a/Курс 3/Проектирование БД/Курисовая/Ред_РПЗ_Кринкин.docx
+++ b/Курс 3/Проектирование БД/Курисовая/Ред_РПЗ_Кринкин.docx
@@ -1,6 +1,6 @@
 
 <file path=word/document.xml><?xml version="1.0" encoding="utf-8"?>
-<w:document xmlns:wpc="http://schemas.microsoft.com/office/word/2010/wordprocessingCanvas" xmlns:cx="http://schemas.microsoft.com/office/drawing/2014/chartex" xmlns:cx1="http://schemas.microsoft.com/office/drawing/2015/9/8/chartex" xmlns:cx2="http://schemas.microsoft.com/office/drawing/2015/10/21/chartex" xmlns:cx3="http://schemas.microsoft.com/office/drawing/2016/5/9/chartex" xmlns:cx4="http://schemas.microsoft.com/office/drawing/2016/5/10/chartex" xmlns:cx5="http://schemas.microsoft.com/office/drawing/2016/5/11/chartex" xmlns:cx6="http://schemas.microsoft.com/office/drawing/2016/5/12/chartex" xmlns:cx7="http://schemas.microsoft.com/office/drawing/2016/5/13/chartex" xmlns:cx8="http://schemas.microsoft.com/office/drawing/2016/5/14/chartex" xmlns:mc="http://schemas.openxmlformats.org/markup-compatibility/2006" xmlns:aink="http://schemas.microsoft.com/office/drawing/2016/ink" xmlns:am3d="http://schemas.microsoft.com/office/drawing/2017/model3d" xmlns:o="urn:schemas-microsoft-com:office:office" xmlns:oel="http://schemas.microsoft.com/office/2019/extlst" xmlns:r="http://schemas.openxmlformats.org/officeDocument/2006/relationships" xmlns:m="http://schemas.openxmlformats.org/officeDocument/2006/math" xmlns:v="urn:schemas-microsoft-com:vml" xmlns:wp14="http://schemas.microsoft.com/office/word/2010/wordprocessingDrawing" xmlns:wp="http://schemas.openxmlformats.org/drawingml/2006/wordprocessingDrawing" xmlns:w10="urn:schemas-microsoft-com:office:word" xmlns:w="http://schemas.openxmlformats.org/wordprocessingml/2006/main" xmlns:w14="http://schemas.microsoft.com/office/word/2010/wordml" xmlns:w15="http://schemas.microsoft.com/office/word/2012/wordml" xmlns:w16cex="http://schemas.microsoft.com/office/word/2018/wordml/cex" xmlns:w16cid="http://schemas.microsoft.com/office/word/2016/wordml/cid" xmlns:w16="http://schemas.microsoft.com/office/word/2018/wordml" xmlns:w16du="http://schemas.microsoft.com/office/word/2023/wordml/word16du" xmlns:w16sdtdh="http://schemas.microsoft.com/office/word/2020/wordml/sdtdatahash" xmlns:w16sdtfl="http://schemas.microsoft.com/office/word/2024/wordml/sdtformatlock" xmlns:w16se="http://schemas.microsoft.com/office/word/2015/wordml/symex" xmlns:wpg="http://schemas.microsoft.com/office/word/2010/wordprocessingGroup" xmlns:wpi="http://schemas.microsoft.com/office/word/2010/wordprocessingInk" xmlns:wne="http://schemas.microsoft.com/office/word/2006/wordml" xmlns:wps="http://schemas.microsoft.com/office/word/2010/wordprocessingShape" mc:Ignorable="w14 w15 w16se w16cid w16 w16cex w16sdtdh w16sdtfl w16du wp14">
+<w:document xmlns:wpc="http://schemas.microsoft.com/office/word/2010/wordprocessingCanvas" xmlns:cx="http://schemas.microsoft.com/office/drawing/2014/chartex" xmlns:cx1="http://schemas.microsoft.com/office/drawing/2015/9/8/chartex" xmlns:cx2="http://schemas.microsoft.com/office/drawing/2015/10/21/chartex" xmlns:cx3="http://schemas.microsoft.com/office/drawing/2016/5/9/chartex" xmlns:cx4="http://schemas.microsoft.com/office/drawing/2016/5/10/chartex" xmlns:cx5="http://schemas.microsoft.com/office/drawing/2016/5/11/chartex" xmlns:cx6="http://schemas.microsoft.com/office/drawing/2016/5/12/chartex" xmlns:cx7="http://schemas.microsoft.com/office/drawing/2016/5/13/chartex" xmlns:cx8="http://schemas.microsoft.com/office/drawing/2016/5/14/chartex" xmlns:mc="http://schemas.openxmlformats.org/markup-compatibility/2006" xmlns:m="http://schemas.openxmlformats.org/officeDocument/2006/math" xmlns:aink="http://schemas.microsoft.com/office/drawing/2016/ink" xmlns:am3d="http://schemas.microsoft.com/office/drawing/2017/model3d" xmlns:oel="http://schemas.microsoft.com/office/2019/extlst" xmlns:r="http://schemas.openxmlformats.org/officeDocument/2006/relationships" xmlns:wp14="http://schemas.microsoft.com/office/word/2010/wordprocessingDrawing" xmlns:wp="http://schemas.openxmlformats.org/drawingml/2006/wordprocessingDrawing" xmlns:wpg="http://schemas.microsoft.com/office/word/2010/wordprocessingGroup" xmlns:wpi="http://schemas.microsoft.com/office/word/2010/wordprocessingInk" xmlns:wps="http://schemas.microsoft.com/office/word/2010/wordprocessingShape" xmlns:o="urn:schemas-microsoft-com:office:office" xmlns:v="urn:schemas-microsoft-com:vml" xmlns:w10="urn:schemas-microsoft-com:office:word" xmlns:w="http://schemas.openxmlformats.org/wordprocessingml/2006/main" xmlns:w14="http://schemas.microsoft.com/office/word/2010/wordml" xmlns:w15="http://schemas.microsoft.com/office/word/2012/wordml" xmlns:w16cex="http://schemas.microsoft.com/office/word/2018/wordml/cex" xmlns:w16cid="http://schemas.microsoft.com/office/word/2016/wordml/cid" xmlns:w16="http://schemas.microsoft.com/office/word/2018/wordml" xmlns:w16sdtdh="http://schemas.microsoft.com/office/word/2020/wordml/sdtdatahash" xmlns:w16sdtfl="http://schemas.microsoft.com/office/word/2024/wordml/sdtformatlock" xmlns:w16se="http://schemas.microsoft.com/office/word/2015/wordml/symex" xmlns:w16du="http://schemas.microsoft.com/office/word/2023/wordml/word16du" xmlns:wne="http://schemas.microsoft.com/office/word/2006/wordml" mc:Ignorable="w14 w15 w16se w16cid w16 w16cex w16sdtdh w16sdtfl w16du wp14">
   <w:body>
     <w:p>
       <w:pPr>
@@ -2061,7 +2061,7 @@
               <w:i w:val="0"/>
               <w:iCs w:val="0"/>
               <w:noProof/>
-              <w:color w:val="EE0000"/>
+              <w:color w:val="FFC000"/>
               <w:sz w:val="28"/>
               <w:szCs w:val="28"/>
             </w:rPr>
@@ -2076,7 +2076,7 @@
                 <w:i w:val="0"/>
                 <w:iCs w:val="0"/>
                 <w:noProof/>
-                <w:color w:val="EE0000"/>
+                <w:color w:val="FFC000"/>
                 <w:sz w:val="28"/>
                 <w:szCs w:val="28"/>
               </w:rPr>
@@ -2091,7 +2091,7 @@
                 <w:iCs w:val="0"/>
                 <w:noProof/>
                 <w:webHidden/>
-                <w:color w:val="EE0000"/>
+                <w:color w:val="FFC000"/>
                 <w:sz w:val="28"/>
                 <w:szCs w:val="28"/>
               </w:rPr>
@@ -2106,7 +2106,7 @@
                 <w:iCs w:val="0"/>
                 <w:noProof/>
                 <w:webHidden/>
-                <w:color w:val="EE0000"/>
+                <w:color w:val="FFC000"/>
                 <w:sz w:val="28"/>
                 <w:szCs w:val="28"/>
               </w:rPr>
@@ -2121,7 +2121,7 @@
                 <w:iCs w:val="0"/>
                 <w:noProof/>
                 <w:webHidden/>
-                <w:color w:val="EE0000"/>
+                <w:color w:val="FFC000"/>
                 <w:sz w:val="28"/>
                 <w:szCs w:val="28"/>
               </w:rPr>
@@ -2136,7 +2136,7 @@
                 <w:iCs w:val="0"/>
                 <w:noProof/>
                 <w:webHidden/>
-                <w:color w:val="EE0000"/>
+                <w:color w:val="FFC000"/>
                 <w:sz w:val="28"/>
                 <w:szCs w:val="28"/>
               </w:rPr>
@@ -2150,7 +2150,7 @@
                 <w:iCs w:val="0"/>
                 <w:noProof/>
                 <w:webHidden/>
-                <w:color w:val="EE0000"/>
+                <w:color w:val="FFC000"/>
                 <w:sz w:val="28"/>
                 <w:szCs w:val="28"/>
               </w:rPr>
@@ -2165,7 +2165,7 @@
                 <w:iCs w:val="0"/>
                 <w:noProof/>
                 <w:webHidden/>
-                <w:color w:val="EE0000"/>
+                <w:color w:val="FFC000"/>
                 <w:sz w:val="28"/>
                 <w:szCs w:val="28"/>
               </w:rPr>
@@ -2180,7 +2180,7 @@
                 <w:iCs w:val="0"/>
                 <w:noProof/>
                 <w:webHidden/>
-                <w:color w:val="EE0000"/>
+                <w:color w:val="FFC000"/>
                 <w:sz w:val="28"/>
                 <w:szCs w:val="28"/>
               </w:rPr>
@@ -4082,6 +4082,1767 @@
     </w:p>
     <w:p>
       <w:pPr>
+        <w:rPr>
+          <w:szCs w:val="28"/>
+        </w:rPr>
+      </w:pPr>
+      <w:r>
+        <w:rPr>
+          <w:szCs w:val="28"/>
+        </w:rPr>
+        <w:t xml:space="preserve">Моделирование данных – это процесс создания структурированного представления данных, который определяет, как данные организованы, как они хранятся и как взаимодействуют </w:t>
+      </w:r>
+      <w:r>
+        <w:rPr>
+          <w:szCs w:val="28"/>
+        </w:rPr>
+        <w:t>[</w:t>
+      </w:r>
+      <w:r>
+        <w:rPr>
+          <w:szCs w:val="28"/>
+        </w:rPr>
+        <w:t>5</w:t>
+      </w:r>
+      <w:r>
+        <w:rPr>
+          <w:szCs w:val="28"/>
+        </w:rPr>
+        <w:t>]</w:t>
+      </w:r>
+      <w:r>
+        <w:rPr>
+          <w:szCs w:val="28"/>
+        </w:rPr>
+        <w:t>. Существуют следующие типы моделей данных:</w:t>
+      </w:r>
+    </w:p>
+    <w:p>
+      <w:pPr>
+        <w:pStyle w:val="a7"/>
+        <w:widowControl w:val="0"/>
+        <w:numPr>
+          <w:ilvl w:val="0"/>
+          <w:numId w:val="11"/>
+        </w:numPr>
+        <w:autoSpaceDE w:val="0"/>
+        <w:autoSpaceDN w:val="0"/>
+        <w:ind w:left="0" w:firstLine="426"/>
+        <w:rPr>
+          <w:szCs w:val="28"/>
+        </w:rPr>
+      </w:pPr>
+      <w:r>
+        <w:rPr>
+          <w:szCs w:val="28"/>
+        </w:rPr>
+        <w:t>концептуальная модель – описание сущностей и их связей</w:t>
+      </w:r>
+      <w:r>
+        <w:rPr>
+          <w:szCs w:val="28"/>
+        </w:rPr>
+        <w:t>;</w:t>
+      </w:r>
+    </w:p>
+    <w:p>
+      <w:pPr>
+        <w:pStyle w:val="a7"/>
+        <w:widowControl w:val="0"/>
+        <w:numPr>
+          <w:ilvl w:val="0"/>
+          <w:numId w:val="11"/>
+        </w:numPr>
+        <w:autoSpaceDE w:val="0"/>
+        <w:autoSpaceDN w:val="0"/>
+        <w:ind w:left="0" w:firstLine="426"/>
+        <w:rPr>
+          <w:szCs w:val="28"/>
+        </w:rPr>
+      </w:pPr>
+      <w:r>
+        <w:rPr>
+          <w:szCs w:val="28"/>
+        </w:rPr>
+        <w:t>логическая модель – детализация концептуальной модели (добавляются атрибуты, типы данных, ключи), но без привязки к конкретной системе управления базами данных (СУБД)</w:t>
+      </w:r>
+      <w:r>
+        <w:rPr>
+          <w:szCs w:val="28"/>
+        </w:rPr>
+        <w:t>;</w:t>
+      </w:r>
+    </w:p>
+    <w:p>
+      <w:pPr>
+        <w:pStyle w:val="a7"/>
+        <w:widowControl w:val="0"/>
+        <w:numPr>
+          <w:ilvl w:val="0"/>
+          <w:numId w:val="11"/>
+        </w:numPr>
+        <w:autoSpaceDE w:val="0"/>
+        <w:autoSpaceDN w:val="0"/>
+        <w:ind w:left="0" w:firstLine="426"/>
+        <w:rPr>
+          <w:szCs w:val="28"/>
+        </w:rPr>
+      </w:pPr>
+      <w:r>
+        <w:rPr>
+          <w:szCs w:val="28"/>
+        </w:rPr>
+        <w:t>физическая модель – реализация логической модели в конкретной СУБД.</w:t>
+      </w:r>
+    </w:p>
+    <w:p>
+      <w:r>
+        <w:t>Цель инфологического моделирования – обеспечение наиболее</w:t>
+      </w:r>
+      <w:r>
+        <w:t xml:space="preserve"> </w:t>
+      </w:r>
+      <w:r>
+        <w:t>естественных для человека способов сбора и представления той информации, которую предполагается хранить в создаваемой базе данных. Поэтому инфологическую модель данных пытаются строить по аналогии с</w:t>
+      </w:r>
+      <w:r>
+        <w:t xml:space="preserve"> </w:t>
+      </w:r>
+      <w:r>
+        <w:t>естественным языком (последний не может быть использован в чистом виде</w:t>
+      </w:r>
+      <w:r>
+        <w:t xml:space="preserve"> </w:t>
+      </w:r>
+      <w:r>
+        <w:t>из-за сложности компьютерной обработки текстов и неоднозначности любого</w:t>
+      </w:r>
+      <w:r>
+        <w:t xml:space="preserve"> </w:t>
+      </w:r>
+      <w:r>
+        <w:t>естественного языка). Основными конструктивными элементами</w:t>
+      </w:r>
+      <w:r>
+        <w:t xml:space="preserve"> </w:t>
+      </w:r>
+      <w:r>
+        <w:t>инфологических моделей являются сущности, связи между ними и их свойства</w:t>
+      </w:r>
+      <w:r>
+        <w:t xml:space="preserve"> </w:t>
+      </w:r>
+      <w:r>
+        <w:t>(атрибуты)</w:t>
+      </w:r>
+      <w:r>
+        <w:t xml:space="preserve"> </w:t>
+      </w:r>
+      <w:r>
+        <w:t>[7]</w:t>
+      </w:r>
+      <w:r>
+        <w:t>.</w:t>
+      </w:r>
+    </w:p>
+    <w:p>
+      <w:r>
+        <w:t>Сущность – любой различимый объект (объект, который мы можем</w:t>
+      </w:r>
+      <w:r>
+        <w:t xml:space="preserve"> </w:t>
+      </w:r>
+      <w:r>
+        <w:t>отличить от другого), информацию о котором необходимо хранить в базе</w:t>
+      </w:r>
+      <w:r>
+        <w:t xml:space="preserve"> </w:t>
+      </w:r>
+      <w:r>
+        <w:t>данных. Сущностями могут быть люди, места, самолеты, рейсы, вкус, цвет и</w:t>
+      </w:r>
+      <w:r>
+        <w:t xml:space="preserve"> </w:t>
+      </w:r>
+      <w:r>
+        <w:t>т.д. Необходимо различать такие понятия, как тип сущности и экземпляр</w:t>
+      </w:r>
+      <w:r>
+        <w:t xml:space="preserve"> </w:t>
+      </w:r>
+      <w:r>
+        <w:t>сущности. Понятие тип сущности относится к набору однородных личностей,</w:t>
+      </w:r>
+      <w:r>
+        <w:t xml:space="preserve"> </w:t>
+      </w:r>
+      <w:r>
+        <w:t>предметов, событий или идей, выступающих как целое. Экземпляр сущности</w:t>
+      </w:r>
+      <w:r>
+        <w:t xml:space="preserve"> </w:t>
+      </w:r>
+      <w:r>
+        <w:t>относится к конкретной вещи в наборе. Например, типом сущности может</w:t>
+      </w:r>
+      <w:r>
+        <w:t xml:space="preserve"> </w:t>
+      </w:r>
+      <w:r>
+        <w:t>быть ГОРОД, а экземпляром – Москва, Киев и т.</w:t>
+      </w:r>
+      <w:r>
+        <w:t xml:space="preserve"> </w:t>
+      </w:r>
+      <w:r>
+        <w:t>д</w:t>
+      </w:r>
+      <w:r>
+        <w:t xml:space="preserve">. </w:t>
+      </w:r>
+      <w:r>
+        <w:t>[7]</w:t>
+      </w:r>
+      <w:r>
+        <w:t>.</w:t>
+      </w:r>
+    </w:p>
+    <w:p>
+      <w:r>
+        <w:t>Атрибут – поименованная характеристика сущности. Его наименование</w:t>
+      </w:r>
+      <w:r>
+        <w:t xml:space="preserve"> </w:t>
+      </w:r>
+      <w:r>
+        <w:t>должно быть уникальным для конкретного типа сущности, но может быть</w:t>
+      </w:r>
+      <w:r>
+        <w:t xml:space="preserve"> </w:t>
+      </w:r>
+      <w:r>
+        <w:t>одинаковым для различного типа сущностей (например, ЦВЕТ может быть</w:t>
+      </w:r>
+      <w:r>
+        <w:t xml:space="preserve"> </w:t>
+      </w:r>
+      <w:r>
+        <w:t>определен для многих сущностей: СОБАКА, АВТОМОБИЛЬ, ДЫМ и т.д.).</w:t>
+      </w:r>
+      <w:r>
+        <w:t xml:space="preserve"> </w:t>
+      </w:r>
+      <w:r>
+        <w:t>Атрибуты используются для определения того, какая информация должна</w:t>
+      </w:r>
+      <w:r>
+        <w:t xml:space="preserve"> </w:t>
+      </w:r>
+      <w:r>
+        <w:t>быть собрана о сущности. Примерами атрибутов для сущности</w:t>
+      </w:r>
+      <w:r>
+        <w:t xml:space="preserve"> </w:t>
+      </w:r>
+      <w:r>
+        <w:t>АВТОМОБИЛЬ являются ТИП, МАРКА, НОМЕРНОЙ ЗНАК, ЦВЕТ и т.д.</w:t>
+      </w:r>
+      <w:r>
+        <w:t xml:space="preserve"> </w:t>
+      </w:r>
+      <w:r>
+        <w:t>Здесь также существует различие между типом и экземпляром</w:t>
+      </w:r>
+      <w:r>
+        <w:t xml:space="preserve"> </w:t>
+      </w:r>
+      <w:r>
+        <w:t>[7]</w:t>
+      </w:r>
+      <w:r>
+        <w:t>.</w:t>
+      </w:r>
+    </w:p>
+    <w:p>
+      <w:r>
+        <w:t>Ключ – минимальный набор атрибутов, по значениям которых можно однозначно найти требуемый экземпляр сущности. Минимальность означает, что исключение из набора любого атрибута не позволяет идентифицировать сущность по оставшимся</w:t>
+      </w:r>
+      <w:r>
+        <w:t xml:space="preserve"> </w:t>
+      </w:r>
+      <w:r>
+        <w:t>[7]</w:t>
+      </w:r>
+      <w:r>
+        <w:t>.</w:t>
+      </w:r>
+    </w:p>
+    <w:p>
+      <w:r>
+        <w:t xml:space="preserve">Связь – ассоциирование двух или более сущностей. Если бы назначением базы данных было только хранение отдельных, не связанных между собой данных, то ее структура могла бы быть очень простой. Однако одно из основных требований к организации базы данных – это обеспечение возможности отыскания одних сущностей по значениям других, для чего необходимо установить между ними определенные связи. А так как в реальных </w:t>
+      </w:r>
+      <w:r>
+        <w:lastRenderedPageBreak/>
+        <w:t>базах данных нередко содержатся сотни или даже тысячи сущностей, то теоретически между ними может быть установлено более миллиона связей. Наличие такого множества связей и определяет сложность</w:t>
+      </w:r>
+      <w:r>
+        <w:t xml:space="preserve"> инфологических моделей</w:t>
+      </w:r>
+      <w:r>
+        <w:t xml:space="preserve"> </w:t>
+      </w:r>
+      <w:r>
+        <w:t>[7]</w:t>
+      </w:r>
+      <w:r>
+        <w:t>.</w:t>
+      </w:r>
+    </w:p>
+    <w:p>
+      <w:pPr>
+        <w:rPr>
+          <w:szCs w:val="28"/>
+        </w:rPr>
+      </w:pPr>
+      <w:r>
+        <w:rPr>
+          <w:szCs w:val="28"/>
+        </w:rPr>
+        <w:t>Связи классифицируются по количеству соотносящихся экземпляров:</w:t>
+      </w:r>
+    </w:p>
+    <w:p>
+      <w:pPr>
+        <w:pStyle w:val="a7"/>
+        <w:widowControl w:val="0"/>
+        <w:numPr>
+          <w:ilvl w:val="0"/>
+          <w:numId w:val="12"/>
+        </w:numPr>
+        <w:autoSpaceDE w:val="0"/>
+        <w:autoSpaceDN w:val="0"/>
+        <w:ind w:left="0" w:firstLine="426"/>
+        <w:rPr>
+          <w:szCs w:val="28"/>
+        </w:rPr>
+      </w:pPr>
+      <w:r>
+        <w:rPr>
+          <w:szCs w:val="28"/>
+        </w:rPr>
+        <w:t>о</w:t>
+      </w:r>
+      <w:r>
+        <w:rPr>
+          <w:szCs w:val="28"/>
+        </w:rPr>
+        <w:t xml:space="preserve">дин к одному (1:1) </w:t>
+      </w:r>
+      <w:r>
+        <w:rPr>
+          <w:szCs w:val="28"/>
+        </w:rPr>
+        <w:t xml:space="preserve">– </w:t>
+      </w:r>
+      <w:r>
+        <w:rPr>
+          <w:szCs w:val="28"/>
+        </w:rPr>
+        <w:t>уникальное соответствие</w:t>
+      </w:r>
+      <w:r>
+        <w:rPr>
+          <w:szCs w:val="28"/>
+        </w:rPr>
+        <w:t>, одному объекту первой сущности соответствует один объект второй сущности</w:t>
+      </w:r>
+      <w:r>
+        <w:rPr>
+          <w:szCs w:val="28"/>
+        </w:rPr>
+        <w:t xml:space="preserve"> [</w:t>
+      </w:r>
+      <w:r>
+        <w:rPr>
+          <w:szCs w:val="28"/>
+        </w:rPr>
+        <w:t>10</w:t>
+      </w:r>
+      <w:r>
+        <w:rPr>
+          <w:szCs w:val="28"/>
+        </w:rPr>
+        <w:t>]</w:t>
+      </w:r>
+      <w:r>
+        <w:rPr>
+          <w:szCs w:val="28"/>
+        </w:rPr>
+        <w:t>;</w:t>
+      </w:r>
+    </w:p>
+    <w:p>
+      <w:pPr>
+        <w:pStyle w:val="a7"/>
+        <w:widowControl w:val="0"/>
+        <w:numPr>
+          <w:ilvl w:val="0"/>
+          <w:numId w:val="12"/>
+        </w:numPr>
+        <w:autoSpaceDE w:val="0"/>
+        <w:autoSpaceDN w:val="0"/>
+        <w:ind w:left="0" w:firstLine="426"/>
+        <w:rPr>
+          <w:szCs w:val="28"/>
+        </w:rPr>
+      </w:pPr>
+      <w:r>
+        <w:rPr>
+          <w:szCs w:val="28"/>
+        </w:rPr>
+        <w:t>один ко многим (1:M) – иерархическая зависимость</w:t>
+      </w:r>
+      <w:r>
+        <w:rPr>
+          <w:szCs w:val="28"/>
+        </w:rPr>
+        <w:t>, одному объекту первой сущности соответствует множество объектов второй сущности</w:t>
+      </w:r>
+      <w:r>
+        <w:rPr>
+          <w:szCs w:val="28"/>
+        </w:rPr>
+        <w:t xml:space="preserve"> [</w:t>
+      </w:r>
+      <w:r>
+        <w:rPr>
+          <w:szCs w:val="28"/>
+        </w:rPr>
+        <w:t>10</w:t>
+      </w:r>
+      <w:r>
+        <w:rPr>
+          <w:szCs w:val="28"/>
+        </w:rPr>
+        <w:t>]</w:t>
+      </w:r>
+      <w:r>
+        <w:rPr>
+          <w:szCs w:val="28"/>
+        </w:rPr>
+        <w:t>;</w:t>
+      </w:r>
+    </w:p>
+    <w:p>
+      <w:pPr>
+        <w:pStyle w:val="a7"/>
+        <w:widowControl w:val="0"/>
+        <w:numPr>
+          <w:ilvl w:val="0"/>
+          <w:numId w:val="12"/>
+        </w:numPr>
+        <w:autoSpaceDE w:val="0"/>
+        <w:autoSpaceDN w:val="0"/>
+        <w:ind w:left="0" w:firstLine="426"/>
+        <w:rPr>
+          <w:szCs w:val="28"/>
+        </w:rPr>
+      </w:pPr>
+      <w:r>
+        <w:rPr>
+          <w:szCs w:val="28"/>
+        </w:rPr>
+        <w:t>м</w:t>
+      </w:r>
+      <w:r>
+        <w:rPr>
+          <w:szCs w:val="28"/>
+        </w:rPr>
+        <w:t>ногие ко многим (M:</w:t>
+      </w:r>
+      <w:r>
+        <w:rPr>
+          <w:szCs w:val="28"/>
+          <w:lang w:val="en-US"/>
+        </w:rPr>
+        <w:t>M</w:t>
+      </w:r>
+      <w:r>
+        <w:rPr>
+          <w:szCs w:val="28"/>
+        </w:rPr>
+        <w:t xml:space="preserve">) </w:t>
+      </w:r>
+      <w:r>
+        <w:rPr>
+          <w:szCs w:val="28"/>
+        </w:rPr>
+        <w:t>–</w:t>
+      </w:r>
+      <w:r>
+        <w:rPr>
+          <w:szCs w:val="28"/>
+        </w:rPr>
+        <w:t xml:space="preserve"> множественное соответствие</w:t>
+      </w:r>
+      <w:r>
+        <w:rPr>
+          <w:szCs w:val="28"/>
+        </w:rPr>
+        <w:t>, многим объектам первой сущности соответствует множество объектов второй сущности</w:t>
+      </w:r>
+      <w:r>
+        <w:rPr>
+          <w:szCs w:val="28"/>
+        </w:rPr>
+        <w:t xml:space="preserve"> [</w:t>
+      </w:r>
+      <w:r>
+        <w:rPr>
+          <w:szCs w:val="28"/>
+        </w:rPr>
+        <w:t>10</w:t>
+      </w:r>
+      <w:r>
+        <w:rPr>
+          <w:szCs w:val="28"/>
+        </w:rPr>
+        <w:t>]</w:t>
+      </w:r>
+      <w:r>
+        <w:rPr>
+          <w:szCs w:val="28"/>
+        </w:rPr>
+        <w:t>.</w:t>
+      </w:r>
+    </w:p>
+    <w:p>
+      <w:pPr>
+        <w:rPr>
+          <w:szCs w:val="28"/>
+        </w:rPr>
+      </w:pPr>
+      <w:r>
+        <w:rPr>
+          <w:szCs w:val="28"/>
+        </w:rPr>
+        <w:t xml:space="preserve">Модели данных </w:t>
+      </w:r>
+      <w:r>
+        <w:rPr>
+          <w:szCs w:val="28"/>
+        </w:rPr>
+        <w:t>–</w:t>
+      </w:r>
+      <w:r>
+        <w:rPr>
+          <w:szCs w:val="28"/>
+        </w:rPr>
+        <w:t xml:space="preserve"> это способы организации, хранения и управления данными в информационных системах. Они определяют структуру данных, методы доступа к ним и правила их обработки</w:t>
+      </w:r>
+      <w:r>
+        <w:rPr>
+          <w:szCs w:val="28"/>
+        </w:rPr>
+        <w:t xml:space="preserve"> </w:t>
+      </w:r>
+      <w:r>
+        <w:rPr>
+          <w:szCs w:val="28"/>
+        </w:rPr>
+        <w:t>[</w:t>
+      </w:r>
+      <w:r>
+        <w:rPr>
+          <w:szCs w:val="28"/>
+        </w:rPr>
+        <w:t>9</w:t>
+      </w:r>
+      <w:r>
+        <w:rPr>
+          <w:szCs w:val="28"/>
+        </w:rPr>
+        <w:t>]</w:t>
+      </w:r>
+      <w:r>
+        <w:rPr>
+          <w:szCs w:val="28"/>
+        </w:rPr>
+        <w:t>.</w:t>
+      </w:r>
+      <w:r>
+        <w:rPr>
+          <w:szCs w:val="28"/>
+        </w:rPr>
+        <w:t xml:space="preserve"> К основным моделям данных относятся:</w:t>
+      </w:r>
+    </w:p>
+    <w:p>
+      <w:pPr>
+        <w:pStyle w:val="a7"/>
+        <w:widowControl w:val="0"/>
+        <w:numPr>
+          <w:ilvl w:val="0"/>
+          <w:numId w:val="12"/>
+        </w:numPr>
+        <w:autoSpaceDE w:val="0"/>
+        <w:autoSpaceDN w:val="0"/>
+        <w:ind w:left="0" w:firstLine="426"/>
+        <w:rPr>
+          <w:szCs w:val="28"/>
+        </w:rPr>
+      </w:pPr>
+      <w:r>
+        <w:rPr>
+          <w:szCs w:val="28"/>
+        </w:rPr>
+        <w:t>модель, основанная на</w:t>
+      </w:r>
+      <w:r>
+        <w:rPr>
+          <w:szCs w:val="28"/>
+        </w:rPr>
+        <w:t xml:space="preserve"> инвертированных списк</w:t>
+      </w:r>
+      <w:r>
+        <w:rPr>
+          <w:szCs w:val="28"/>
+        </w:rPr>
+        <w:t>ах (рис. 1),</w:t>
+      </w:r>
+      <w:r>
+        <w:rPr>
+          <w:szCs w:val="28"/>
+        </w:rPr>
+        <w:t xml:space="preserve"> организует данные через специальные индексные структуры, где для каждого уникального значения атрибута хранится список указателей на соответствующие записи, что обеспечивает быстрый поиск, но требует постоянного обновления индексов и уступает реляционным системам в обработке сложных запросов с соединениями таблиц</w:t>
+      </w:r>
+      <w:r>
+        <w:rPr>
+          <w:szCs w:val="28"/>
+        </w:rPr>
+        <w:t xml:space="preserve"> </w:t>
+      </w:r>
+      <w:r>
+        <w:rPr>
+          <w:szCs w:val="28"/>
+        </w:rPr>
+        <w:t>[</w:t>
+      </w:r>
+      <w:r>
+        <w:rPr>
+          <w:szCs w:val="28"/>
+        </w:rPr>
+        <w:t>8</w:t>
+      </w:r>
+      <w:r>
+        <w:rPr>
+          <w:szCs w:val="28"/>
+        </w:rPr>
+        <w:t>]</w:t>
+      </w:r>
+      <w:r>
+        <w:rPr>
+          <w:szCs w:val="28"/>
+        </w:rPr>
+        <w:t>;</w:t>
+      </w:r>
+    </w:p>
+    <w:p>
+      <w:pPr>
+        <w:pStyle w:val="a7"/>
+        <w:widowControl w:val="0"/>
+        <w:autoSpaceDE w:val="0"/>
+        <w:autoSpaceDN w:val="0"/>
+        <w:ind w:left="426" w:firstLine="0"/>
+        <w:rPr>
+          <w:szCs w:val="28"/>
+        </w:rPr>
+      </w:pPr>
+    </w:p>
+    <w:p>
+      <w:pPr>
+        <w:keepNext/>
+        <w:jc w:val="center"/>
+      </w:pPr>
+      <w:r>
+        <w:fldChar w:fldCharType="begin"/>
+      </w:r>
+      <w:r>
+        <w:instrText xml:space="preserve"> INCLUDEPICTURE "https://avatars.mds.yandex.net/i?id=44124173f0023ce2e5a255d514e3d417_l-5163192-images-thumbs&amp;n=13" \* MERGEFORMATINET </w:instrText>
+      </w:r>
+      <w:r>
+        <w:fldChar w:fldCharType="separate"/>
+      </w:r>
+      <w:r>
+        <w:rPr>
+          <w:noProof/>
+        </w:rPr>
+        <w:drawing>
+          <wp:inline distT="0" distB="0" distL="0" distR="0" wp14:anchorId="5E13DC2B" wp14:editId="49F5579C">
+            <wp:extent cx="3405494" cy="4289196"/>
+            <wp:effectExtent l="0" t="0" r="0" b="3810"/>
+            <wp:docPr id="1501147172" name="Рисунок 1" descr="Picture background"/>
+            <wp:cNvGraphicFramePr>
+              <a:graphicFrameLocks xmlns:a="http://schemas.openxmlformats.org/drawingml/2006/main" noChangeAspect="1"/>
+            </wp:cNvGraphicFramePr>
+            <a:graphic xmlns:a="http://schemas.openxmlformats.org/drawingml/2006/main">
+              <a:graphicData uri="http://schemas.openxmlformats.org/drawingml/2006/picture">
+                <pic:pic xmlns:pic="http://schemas.openxmlformats.org/drawingml/2006/picture">
+                  <pic:nvPicPr>
+                    <pic:cNvPr id="0" name="Picture 1" descr="Picture background"/>
+                    <pic:cNvPicPr>
+                      <a:picLocks noChangeAspect="1" noChangeArrowheads="1"/>
+                    </pic:cNvPicPr>
+                  </pic:nvPicPr>
+                  <pic:blipFill>
+                    <a:blip r:embed="rId8">
+                      <a:extLst>
+                        <a:ext uri="{28A0092B-C50C-407E-A947-70E740481C1C}">
+                          <a14:useLocalDpi xmlns:a14="http://schemas.microsoft.com/office/drawing/2010/main" val="0"/>
+                        </a:ext>
+                      </a:extLst>
+                    </a:blip>
+                    <a:srcRect/>
+                    <a:stretch>
+                      <a:fillRect/>
+                    </a:stretch>
+                  </pic:blipFill>
+                  <pic:spPr bwMode="auto">
+                    <a:xfrm>
+                      <a:off x="0" y="0"/>
+                      <a:ext cx="3451492" cy="4347131"/>
+                    </a:xfrm>
+                    <a:prstGeom prst="rect">
+                      <a:avLst/>
+                    </a:prstGeom>
+                    <a:noFill/>
+                    <a:ln>
+                      <a:noFill/>
+                    </a:ln>
+                  </pic:spPr>
+                </pic:pic>
+              </a:graphicData>
+            </a:graphic>
+          </wp:inline>
+        </w:drawing>
+      </w:r>
+      <w:r>
+        <w:fldChar w:fldCharType="end"/>
+      </w:r>
+    </w:p>
+    <w:p>
+      <w:pPr>
+        <w:pStyle w:val="af8"/>
+      </w:pPr>
+      <w:r>
+        <w:t xml:space="preserve">Рис. </w:t>
+      </w:r>
+      <w:r>
+        <w:fldChar w:fldCharType="begin"/>
+      </w:r>
+      <w:r>
+        <w:instrText xml:space="preserve"> SEQ Рис. \* ARABIC </w:instrText>
+      </w:r>
+      <w:r>
+        <w:fldChar w:fldCharType="separate"/>
+      </w:r>
+      <w:r>
+        <w:rPr>
+          <w:noProof/>
+        </w:rPr>
+        <w:t>1</w:t>
+      </w:r>
+      <w:r>
+        <w:fldChar w:fldCharType="end"/>
+      </w:r>
+      <w:r>
+        <w:t>.</w:t>
+      </w:r>
+      <w:r>
+        <w:t xml:space="preserve"> Пример модели на инвертированных списках</w:t>
+      </w:r>
+    </w:p>
+    <w:p>
+      <w:pPr>
+        <w:pStyle w:val="a7"/>
+        <w:widowControl w:val="0"/>
+        <w:numPr>
+          <w:ilvl w:val="0"/>
+          <w:numId w:val="12"/>
+        </w:numPr>
+        <w:autoSpaceDE w:val="0"/>
+        <w:autoSpaceDN w:val="0"/>
+        <w:ind w:left="0" w:firstLine="426"/>
+        <w:rPr>
+          <w:szCs w:val="28"/>
+        </w:rPr>
+      </w:pPr>
+      <w:r>
+        <w:rPr>
+          <w:szCs w:val="28"/>
+        </w:rPr>
+        <w:lastRenderedPageBreak/>
+        <w:t>и</w:t>
+      </w:r>
+      <w:r>
+        <w:rPr>
+          <w:szCs w:val="28"/>
+        </w:rPr>
+        <w:t>ерархическая модель</w:t>
+      </w:r>
+      <w:r>
+        <w:rPr>
+          <w:szCs w:val="28"/>
+        </w:rPr>
+        <w:t xml:space="preserve"> (рис. 2)</w:t>
+      </w:r>
+      <w:r>
+        <w:rPr>
+          <w:szCs w:val="28"/>
+        </w:rPr>
+        <w:t xml:space="preserve"> строится по принципу дерева, где каждый узел, за исключением корневого, имеет строго одного родителя, что делает её </w:t>
+      </w:r>
+      <w:r>
+        <w:rPr>
+          <w:szCs w:val="28"/>
+        </w:rPr>
+        <w:t>подходящей</w:t>
+      </w:r>
+      <w:r>
+        <w:rPr>
+          <w:szCs w:val="28"/>
+        </w:rPr>
+        <w:t xml:space="preserve"> для файловых систем и XML-хранилищ, обеспечивая быстрый доступ к данным внутри иерархии, но усложняя работу с информацией вне её структуры</w:t>
+      </w:r>
+      <w:r>
+        <w:rPr>
+          <w:szCs w:val="28"/>
+        </w:rPr>
+        <w:t xml:space="preserve"> [</w:t>
+      </w:r>
+      <w:r>
+        <w:rPr>
+          <w:szCs w:val="28"/>
+        </w:rPr>
+        <w:t>9</w:t>
+      </w:r>
+      <w:r>
+        <w:rPr>
+          <w:szCs w:val="28"/>
+        </w:rPr>
+        <w:t>]</w:t>
+      </w:r>
+      <w:r>
+        <w:rPr>
+          <w:szCs w:val="28"/>
+        </w:rPr>
+        <w:t>;</w:t>
+      </w:r>
+    </w:p>
+    <w:p/>
+    <w:p>
+      <w:pPr>
+        <w:keepNext/>
+        <w:jc w:val="center"/>
+      </w:pPr>
+      <w:r>
+        <w:fldChar w:fldCharType="begin"/>
+      </w:r>
+      <w:r>
+        <w:instrText xml:space="preserve"> INCLUDEPICTURE "https://www.arsis.ru/wp-content/uploads/2023/04/Screenshot_12.png" \* MERGEFORMATINET </w:instrText>
+      </w:r>
+      <w:r>
+        <w:fldChar w:fldCharType="separate"/>
+      </w:r>
+      <w:r>
+        <w:rPr>
+          <w:noProof/>
+        </w:rPr>
+        <w:drawing>
+          <wp:inline distT="0" distB="0" distL="0" distR="0" wp14:anchorId="12A33D0C" wp14:editId="31F97776">
+            <wp:extent cx="3998579" cy="2459802"/>
+            <wp:effectExtent l="0" t="0" r="2540" b="4445"/>
+            <wp:docPr id="612024134" name="Рисунок 2" descr="Picture background"/>
+            <wp:cNvGraphicFramePr>
+              <a:graphicFrameLocks xmlns:a="http://schemas.openxmlformats.org/drawingml/2006/main" noChangeAspect="1"/>
+            </wp:cNvGraphicFramePr>
+            <a:graphic xmlns:a="http://schemas.openxmlformats.org/drawingml/2006/main">
+              <a:graphicData uri="http://schemas.openxmlformats.org/drawingml/2006/picture">
+                <pic:pic xmlns:pic="http://schemas.openxmlformats.org/drawingml/2006/picture">
+                  <pic:nvPicPr>
+                    <pic:cNvPr id="0" name="Picture 3" descr="Picture background"/>
+                    <pic:cNvPicPr>
+                      <a:picLocks noChangeAspect="1" noChangeArrowheads="1"/>
+                    </pic:cNvPicPr>
+                  </pic:nvPicPr>
+                  <pic:blipFill>
+                    <a:blip r:embed="rId9" cstate="print">
+                      <a:extLst>
+                        <a:ext uri="{28A0092B-C50C-407E-A947-70E740481C1C}">
+                          <a14:useLocalDpi xmlns:a14="http://schemas.microsoft.com/office/drawing/2010/main" val="0"/>
+                        </a:ext>
+                      </a:extLst>
+                    </a:blip>
+                    <a:srcRect/>
+                    <a:stretch>
+                      <a:fillRect/>
+                    </a:stretch>
+                  </pic:blipFill>
+                  <pic:spPr bwMode="auto">
+                    <a:xfrm>
+                      <a:off x="0" y="0"/>
+                      <a:ext cx="4033929" cy="2481548"/>
+                    </a:xfrm>
+                    <a:prstGeom prst="rect">
+                      <a:avLst/>
+                    </a:prstGeom>
+                    <a:noFill/>
+                    <a:ln>
+                      <a:noFill/>
+                    </a:ln>
+                  </pic:spPr>
+                </pic:pic>
+              </a:graphicData>
+            </a:graphic>
+          </wp:inline>
+        </w:drawing>
+      </w:r>
+      <w:r>
+        <w:fldChar w:fldCharType="end"/>
+      </w:r>
+    </w:p>
+    <w:p>
+      <w:pPr>
+        <w:pStyle w:val="af8"/>
+      </w:pPr>
+      <w:r>
+        <w:t xml:space="preserve">Рис. </w:t>
+      </w:r>
+      <w:r>
+        <w:fldChar w:fldCharType="begin"/>
+      </w:r>
+      <w:r>
+        <w:instrText xml:space="preserve"> SEQ Рис. \* ARABIC </w:instrText>
+      </w:r>
+      <w:r>
+        <w:fldChar w:fldCharType="separate"/>
+      </w:r>
+      <w:r>
+        <w:rPr>
+          <w:noProof/>
+        </w:rPr>
+        <w:t>2</w:t>
+      </w:r>
+      <w:r>
+        <w:fldChar w:fldCharType="end"/>
+      </w:r>
+      <w:r>
+        <w:t>. Схема иерархической модели</w:t>
+      </w:r>
+    </w:p>
+    <w:p>
+      <w:pPr>
+        <w:pStyle w:val="a7"/>
+        <w:widowControl w:val="0"/>
+        <w:numPr>
+          <w:ilvl w:val="0"/>
+          <w:numId w:val="12"/>
+        </w:numPr>
+        <w:autoSpaceDE w:val="0"/>
+        <w:autoSpaceDN w:val="0"/>
+        <w:ind w:left="0" w:firstLine="426"/>
+        <w:rPr>
+          <w:szCs w:val="28"/>
+        </w:rPr>
+      </w:pPr>
+      <w:r>
+        <w:rPr>
+          <w:szCs w:val="28"/>
+        </w:rPr>
+        <w:t>с</w:t>
+      </w:r>
+      <w:r>
+        <w:rPr>
+          <w:szCs w:val="28"/>
+        </w:rPr>
+        <w:t>етевая модель</w:t>
+      </w:r>
+      <w:r>
+        <w:rPr>
+          <w:szCs w:val="28"/>
+        </w:rPr>
+        <w:t xml:space="preserve"> (рис. 3)</w:t>
+      </w:r>
+      <w:r>
+        <w:rPr>
+          <w:szCs w:val="28"/>
+        </w:rPr>
+        <w:t>, являясь развитием иерархической, допускает наличие нескольких родителей у одного узла, что позволяло ей использоваться в ранних СУБД, однако сложность администрирования привела к её вытеснению реляционными системами</w:t>
+      </w:r>
+      <w:r>
+        <w:rPr>
+          <w:szCs w:val="28"/>
+        </w:rPr>
+        <w:t xml:space="preserve"> [</w:t>
+      </w:r>
+      <w:r>
+        <w:rPr>
+          <w:szCs w:val="28"/>
+        </w:rPr>
+        <w:t>9</w:t>
+      </w:r>
+      <w:r>
+        <w:rPr>
+          <w:szCs w:val="28"/>
+        </w:rPr>
+        <w:t>]</w:t>
+      </w:r>
+      <w:r>
+        <w:rPr>
+          <w:szCs w:val="28"/>
+        </w:rPr>
+        <w:t>;</w:t>
+      </w:r>
+    </w:p>
+    <w:p/>
+    <w:p>
+      <w:pPr>
+        <w:keepNext/>
+        <w:jc w:val="center"/>
+      </w:pPr>
+      <w:r>
+        <w:rPr>
+          <w:noProof/>
+        </w:rPr>
+        <w:drawing>
+          <wp:inline distT="0" distB="0" distL="0" distR="0" wp14:anchorId="0066EC8F" wp14:editId="5355AEC7">
+            <wp:extent cx="3933111" cy="2446054"/>
+            <wp:effectExtent l="0" t="0" r="4445" b="5080"/>
+            <wp:docPr id="1686980895" name="Рисунок 4"/>
+            <wp:cNvGraphicFramePr>
+              <a:graphicFrameLocks xmlns:a="http://schemas.openxmlformats.org/drawingml/2006/main" noChangeAspect="1"/>
+            </wp:cNvGraphicFramePr>
+            <a:graphic xmlns:a="http://schemas.openxmlformats.org/drawingml/2006/main">
+              <a:graphicData uri="http://schemas.openxmlformats.org/drawingml/2006/picture">
+                <pic:pic xmlns:pic="http://schemas.openxmlformats.org/drawingml/2006/picture">
+                  <pic:nvPicPr>
+                    <pic:cNvPr id="1686980895" name="Рисунок 1686980895"/>
+                    <pic:cNvPicPr/>
+                  </pic:nvPicPr>
+                  <pic:blipFill>
+                    <a:blip r:embed="rId10" cstate="print">
+                      <a:extLst>
+                        <a:ext uri="{28A0092B-C50C-407E-A947-70E740481C1C}">
+                          <a14:useLocalDpi xmlns:a14="http://schemas.microsoft.com/office/drawing/2010/main" val="0"/>
+                        </a:ext>
+                      </a:extLst>
+                    </a:blip>
+                    <a:stretch>
+                      <a:fillRect/>
+                    </a:stretch>
+                  </pic:blipFill>
+                  <pic:spPr>
+                    <a:xfrm>
+                      <a:off x="0" y="0"/>
+                      <a:ext cx="3974772" cy="2471963"/>
+                    </a:xfrm>
+                    <a:prstGeom prst="rect">
+                      <a:avLst/>
+                    </a:prstGeom>
+                  </pic:spPr>
+                </pic:pic>
+              </a:graphicData>
+            </a:graphic>
+          </wp:inline>
+        </w:drawing>
+      </w:r>
+    </w:p>
+    <w:p>
+      <w:pPr>
+        <w:pStyle w:val="af8"/>
+      </w:pPr>
+      <w:r>
+        <w:t xml:space="preserve">Рис. </w:t>
+      </w:r>
+      <w:r>
+        <w:fldChar w:fldCharType="begin"/>
+      </w:r>
+      <w:r>
+        <w:instrText xml:space="preserve"> SEQ Рис. \* ARABIC </w:instrText>
+      </w:r>
+      <w:r>
+        <w:fldChar w:fldCharType="separate"/>
+      </w:r>
+      <w:r>
+        <w:rPr>
+          <w:noProof/>
+        </w:rPr>
+        <w:t>3</w:t>
+      </w:r>
+      <w:r>
+        <w:fldChar w:fldCharType="end"/>
+      </w:r>
+      <w:r>
+        <w:t>. Пример сетевой модели данных</w:t>
+      </w:r>
+    </w:p>
+    <w:p>
+      <w:pPr>
+        <w:pStyle w:val="a7"/>
+        <w:widowControl w:val="0"/>
+        <w:numPr>
+          <w:ilvl w:val="0"/>
+          <w:numId w:val="12"/>
+        </w:numPr>
+        <w:autoSpaceDE w:val="0"/>
+        <w:autoSpaceDN w:val="0"/>
+        <w:ind w:left="0" w:firstLine="426"/>
+        <w:rPr>
+          <w:szCs w:val="28"/>
+        </w:rPr>
+      </w:pPr>
+      <w:r>
+        <w:rPr>
+          <w:szCs w:val="28"/>
+        </w:rPr>
+        <w:t>р</w:t>
+      </w:r>
+      <w:r>
+        <w:rPr>
+          <w:szCs w:val="28"/>
+        </w:rPr>
+        <w:t>еляционная модель</w:t>
+      </w:r>
+      <w:r>
+        <w:rPr>
+          <w:szCs w:val="28"/>
+        </w:rPr>
+        <w:t xml:space="preserve"> (рис. 4)</w:t>
+      </w:r>
+      <w:r>
+        <w:rPr>
+          <w:szCs w:val="28"/>
+        </w:rPr>
+        <w:t xml:space="preserve"> организует данные в виде таблиц, связанных между собой через ключи, и доминирует в современных СУБД</w:t>
+      </w:r>
+      <w:r>
+        <w:rPr>
+          <w:szCs w:val="28"/>
+        </w:rPr>
+        <w:t xml:space="preserve"> </w:t>
+      </w:r>
+      <w:r>
+        <w:rPr>
+          <w:szCs w:val="28"/>
+        </w:rPr>
+        <w:t>благодаря своей гибкости и стандартизированному языку</w:t>
+      </w:r>
+      <w:r>
+        <w:rPr>
+          <w:szCs w:val="28"/>
+        </w:rPr>
+        <w:t xml:space="preserve"> запросов</w:t>
+      </w:r>
+      <w:r>
+        <w:rPr>
+          <w:szCs w:val="28"/>
+        </w:rPr>
+        <w:t xml:space="preserve"> SQL, хотя может сталкиваться с проблемами производительности при обработке сверхбольших объёмов данных</w:t>
+      </w:r>
+      <w:r>
+        <w:rPr>
+          <w:szCs w:val="28"/>
+        </w:rPr>
+        <w:t xml:space="preserve"> [</w:t>
+      </w:r>
+      <w:r>
+        <w:rPr>
+          <w:szCs w:val="28"/>
+        </w:rPr>
+        <w:t>9</w:t>
+      </w:r>
+      <w:r>
+        <w:rPr>
+          <w:szCs w:val="28"/>
+        </w:rPr>
+        <w:t>]</w:t>
+      </w:r>
+      <w:r>
+        <w:rPr>
+          <w:szCs w:val="28"/>
+        </w:rPr>
+        <w:t>;</w:t>
+      </w:r>
+    </w:p>
+    <w:p/>
+    <w:p>
+      <w:pPr>
+        <w:keepNext/>
+        <w:jc w:val="center"/>
+      </w:pPr>
+      <w:r>
+        <w:lastRenderedPageBreak/>
+        <w:fldChar w:fldCharType="begin"/>
+      </w:r>
+      <w:r>
+        <w:instrText xml:space="preserve"> INCLUDEPICTURE "https://i.ytimg.com/vi/ExKmy08aZgU/maxresdefault.jpg?sqp=-oaymwEmCIAKENAF8quKqQMa8AEB-AHUBoAC4AOKAgwIABABGGUgZShlMA8=&amp;amp;rs=AOn4CLCgy7OHR1GCkHd5wVHTLpjJtqQ_vQ" \* MERGEFORMATINET </w:instrText>
+      </w:r>
+      <w:r>
+        <w:fldChar w:fldCharType="separate"/>
+      </w:r>
+      <w:r>
+        <w:rPr>
+          <w:noProof/>
+        </w:rPr>
+        <w:drawing>
+          <wp:inline distT="0" distB="0" distL="0" distR="0" wp14:anchorId="00F476D2" wp14:editId="687F3DD6">
+            <wp:extent cx="4570730" cy="2724066"/>
+            <wp:effectExtent l="0" t="0" r="1270" b="0"/>
+            <wp:docPr id="1301395428" name="Рисунок 6" descr="Picture background"/>
+            <wp:cNvGraphicFramePr>
+              <a:graphicFrameLocks xmlns:a="http://schemas.openxmlformats.org/drawingml/2006/main" noChangeAspect="1"/>
+            </wp:cNvGraphicFramePr>
+            <a:graphic xmlns:a="http://schemas.openxmlformats.org/drawingml/2006/main">
+              <a:graphicData uri="http://schemas.openxmlformats.org/drawingml/2006/picture">
+                <pic:pic xmlns:pic="http://schemas.openxmlformats.org/drawingml/2006/picture">
+                  <pic:nvPicPr>
+                    <pic:cNvPr id="0" name="Picture 15" descr="Picture background"/>
+                    <pic:cNvPicPr>
+                      <a:picLocks noChangeAspect="1" noChangeArrowheads="1"/>
+                    </pic:cNvPicPr>
+                  </pic:nvPicPr>
+                  <pic:blipFill rotWithShape="1">
+                    <a:blip r:embed="rId11">
+                      <a:extLst>
+                        <a:ext uri="{28A0092B-C50C-407E-A947-70E740481C1C}">
+                          <a14:useLocalDpi xmlns:a14="http://schemas.microsoft.com/office/drawing/2010/main" val="0"/>
+                        </a:ext>
+                      </a:extLst>
+                    </a:blip>
+                    <a:srcRect l="12631" t="14513" r="12665" b="6360"/>
+                    <a:stretch>
+                      <a:fillRect/>
+                    </a:stretch>
+                  </pic:blipFill>
+                  <pic:spPr bwMode="auto">
+                    <a:xfrm>
+                      <a:off x="0" y="0"/>
+                      <a:ext cx="4571971" cy="2724806"/>
+                    </a:xfrm>
+                    <a:prstGeom prst="rect">
+                      <a:avLst/>
+                    </a:prstGeom>
+                    <a:noFill/>
+                    <a:ln>
+                      <a:noFill/>
+                    </a:ln>
+                    <a:extLst>
+                      <a:ext uri="{53640926-AAD7-44D8-BBD7-CCE9431645EC}">
+                        <a14:shadowObscured xmlns:a14="http://schemas.microsoft.com/office/drawing/2010/main"/>
+                      </a:ext>
+                    </a:extLst>
+                  </pic:spPr>
+                </pic:pic>
+              </a:graphicData>
+            </a:graphic>
+          </wp:inline>
+        </w:drawing>
+      </w:r>
+      <w:r>
+        <w:fldChar w:fldCharType="end"/>
+      </w:r>
+    </w:p>
+    <w:p>
+      <w:pPr>
+        <w:pStyle w:val="af8"/>
+      </w:pPr>
+      <w:r>
+        <w:t xml:space="preserve">Рис. </w:t>
+      </w:r>
+      <w:r>
+        <w:fldChar w:fldCharType="begin"/>
+      </w:r>
+      <w:r>
+        <w:instrText xml:space="preserve"> SEQ Рис. \* ARABIC </w:instrText>
+      </w:r>
+      <w:r>
+        <w:fldChar w:fldCharType="separate"/>
+      </w:r>
+      <w:r>
+        <w:rPr>
+          <w:noProof/>
+        </w:rPr>
+        <w:t>4</w:t>
+      </w:r>
+      <w:r>
+        <w:fldChar w:fldCharType="end"/>
+      </w:r>
+      <w:r>
+        <w:t>. Пример реляционной модели данных</w:t>
+      </w:r>
+    </w:p>
+    <w:p>
+      <w:pPr>
+        <w:pStyle w:val="a7"/>
+        <w:widowControl w:val="0"/>
+        <w:numPr>
+          <w:ilvl w:val="0"/>
+          <w:numId w:val="12"/>
+        </w:numPr>
+        <w:autoSpaceDE w:val="0"/>
+        <w:autoSpaceDN w:val="0"/>
+        <w:ind w:left="0" w:firstLine="426"/>
+        <w:rPr>
+          <w:szCs w:val="28"/>
+        </w:rPr>
+      </w:pPr>
+      <w:r>
+        <w:rPr>
+          <w:szCs w:val="28"/>
+        </w:rPr>
+        <w:t>о</w:t>
+      </w:r>
+      <w:r>
+        <w:rPr>
+          <w:szCs w:val="28"/>
+        </w:rPr>
+        <w:t>бъектно-ориентированная модель представляет данные в виде объектов, сочетающих атрибуты и методы, что делает её удобной для работы со сложными структурами, но ограниченная поддержка инструментария снижает её популярность</w:t>
+      </w:r>
+      <w:r>
+        <w:rPr>
+          <w:szCs w:val="28"/>
+        </w:rPr>
+        <w:t xml:space="preserve"> [</w:t>
+      </w:r>
+      <w:r>
+        <w:rPr>
+          <w:szCs w:val="28"/>
+        </w:rPr>
+        <w:t>9</w:t>
+      </w:r>
+      <w:r>
+        <w:rPr>
+          <w:szCs w:val="28"/>
+        </w:rPr>
+        <w:t>]</w:t>
+      </w:r>
+      <w:r>
+        <w:rPr>
+          <w:szCs w:val="28"/>
+        </w:rPr>
+        <w:t>.</w:t>
+      </w:r>
+    </w:p>
+    <w:p/>
+    <w:p>
+      <w:pPr>
+        <w:keepNext/>
+        <w:jc w:val="center"/>
+      </w:pPr>
+      <w:r>
+        <w:fldChar w:fldCharType="begin"/>
+      </w:r>
+      <w:r>
+        <w:instrText xml:space="preserve"> INCLUDEPICTURE "https://studme.org/htm/img/15/4944/7.png" \* MERGEFORMATINET </w:instrText>
+      </w:r>
+      <w:r>
+        <w:fldChar w:fldCharType="separate"/>
+      </w:r>
+      <w:r>
+        <w:rPr>
+          <w:noProof/>
+        </w:rPr>
+        <w:drawing>
+          <wp:inline distT="0" distB="0" distL="0" distR="0" wp14:anchorId="604883C5" wp14:editId="0AC1461F">
+            <wp:extent cx="4178208" cy="2161067"/>
+            <wp:effectExtent l="0" t="0" r="635" b="0"/>
+            <wp:docPr id="1448579901" name="Рисунок 7" descr="Picture background"/>
+            <wp:cNvGraphicFramePr>
+              <a:graphicFrameLocks xmlns:a="http://schemas.openxmlformats.org/drawingml/2006/main" noChangeAspect="1"/>
+            </wp:cNvGraphicFramePr>
+            <a:graphic xmlns:a="http://schemas.openxmlformats.org/drawingml/2006/main">
+              <a:graphicData uri="http://schemas.openxmlformats.org/drawingml/2006/picture">
+                <pic:pic xmlns:pic="http://schemas.openxmlformats.org/drawingml/2006/picture">
+                  <pic:nvPicPr>
+                    <pic:cNvPr id="0" name="Picture 17" descr="Picture background"/>
+                    <pic:cNvPicPr>
+                      <a:picLocks noChangeAspect="1" noChangeArrowheads="1"/>
+                    </pic:cNvPicPr>
+                  </pic:nvPicPr>
+                  <pic:blipFill>
+                    <a:blip r:embed="rId12">
+                      <a:extLst>
+                        <a:ext uri="{28A0092B-C50C-407E-A947-70E740481C1C}">
+                          <a14:useLocalDpi xmlns:a14="http://schemas.microsoft.com/office/drawing/2010/main" val="0"/>
+                        </a:ext>
+                      </a:extLst>
+                    </a:blip>
+                    <a:srcRect/>
+                    <a:stretch>
+                      <a:fillRect/>
+                    </a:stretch>
+                  </pic:blipFill>
+                  <pic:spPr bwMode="auto">
+                    <a:xfrm>
+                      <a:off x="0" y="0"/>
+                      <a:ext cx="4199373" cy="2172014"/>
+                    </a:xfrm>
+                    <a:prstGeom prst="rect">
+                      <a:avLst/>
+                    </a:prstGeom>
+                    <a:noFill/>
+                    <a:ln>
+                      <a:noFill/>
+                    </a:ln>
+                  </pic:spPr>
+                </pic:pic>
+              </a:graphicData>
+            </a:graphic>
+          </wp:inline>
+        </w:drawing>
+      </w:r>
+      <w:r>
+        <w:fldChar w:fldCharType="end"/>
+      </w:r>
+    </w:p>
+    <w:p>
+      <w:pPr>
+        <w:pStyle w:val="af8"/>
+      </w:pPr>
+      <w:r>
+        <w:t xml:space="preserve">Рис. </w:t>
+      </w:r>
+      <w:r>
+        <w:fldChar w:fldCharType="begin"/>
+      </w:r>
+      <w:r>
+        <w:instrText xml:space="preserve"> SEQ Рис. \* ARABIC </w:instrText>
+      </w:r>
+      <w:r>
+        <w:fldChar w:fldCharType="separate"/>
+      </w:r>
+      <w:r>
+        <w:rPr>
+          <w:noProof/>
+        </w:rPr>
+        <w:t>5</w:t>
+      </w:r>
+      <w:r>
+        <w:fldChar w:fldCharType="end"/>
+      </w:r>
+      <w:r>
+        <w:t>. Схема объектно-ориентированной модели данных</w:t>
+      </w:r>
+    </w:p>
+    <w:p>
+      <w:r>
+        <w:t xml:space="preserve">Для реализации базы данных агентства недвижимости была выбрана реляционная модель данных, так как она обеспечивает достаточную надёжность и гибкость, а также имеет большую поддержку среди программных средств. </w:t>
+      </w:r>
+      <w:r>
+        <w:t>Данные хранятся в таблицах с четкой схемой, что предотвращает ошибки и дублирование. Язык структурированных запросов SQL позволяет выполнять сложные запросы.</w:t>
+      </w:r>
+    </w:p>
+    <w:p>
+      <w:pPr>
+        <w:rPr>
+          <w:szCs w:val="28"/>
+        </w:rPr>
+      </w:pPr>
+      <w:r>
+        <w:rPr>
+          <w:szCs w:val="28"/>
+        </w:rPr>
+        <w:t>При создании концептуальной модели</w:t>
+      </w:r>
+      <w:r>
+        <w:rPr>
+          <w:szCs w:val="28"/>
+        </w:rPr>
+        <w:t xml:space="preserve"> </w:t>
+      </w:r>
+      <w:r>
+        <w:rPr>
+          <w:szCs w:val="28"/>
+        </w:rPr>
+        <w:t>н</w:t>
+      </w:r>
+      <w:r>
+        <w:rPr>
+          <w:szCs w:val="28"/>
+        </w:rPr>
+        <w:t>еобходимо</w:t>
+      </w:r>
+      <w:r>
+        <w:rPr>
+          <w:szCs w:val="28"/>
+        </w:rPr>
+        <w:t xml:space="preserve"> выделить сущность, которая содержит в себе максимальное количество информации о рассматриваемой предметной области. </w:t>
+      </w:r>
+    </w:p>
+    <w:p>
+      <w:pPr>
+        <w:rPr>
+          <w:szCs w:val="28"/>
+        </w:rPr>
+      </w:pPr>
+      <w:r>
+        <w:rPr>
+          <w:szCs w:val="28"/>
+        </w:rPr>
+        <w:t>Для создания концептуальной модели для агентства недвижимости м</w:t>
+      </w:r>
+      <w:r>
+        <w:rPr>
+          <w:szCs w:val="28"/>
+        </w:rPr>
+        <w:t xml:space="preserve">ожно выделить сущность </w:t>
+      </w:r>
+      <w:r>
+        <w:rPr>
+          <w:szCs w:val="28"/>
+        </w:rPr>
+        <w:t>«Сделка»</w:t>
+      </w:r>
+      <w:r>
+        <w:rPr>
+          <w:szCs w:val="28"/>
+        </w:rPr>
+        <w:t xml:space="preserve"> с</w:t>
+      </w:r>
+      <w:r>
+        <w:rPr>
+          <w:szCs w:val="28"/>
+        </w:rPr>
+        <w:t>о следующими</w:t>
+      </w:r>
+      <w:r>
+        <w:rPr>
+          <w:szCs w:val="28"/>
+        </w:rPr>
+        <w:t xml:space="preserve"> атрибутами</w:t>
+      </w:r>
+      <w:r>
+        <w:rPr>
+          <w:szCs w:val="28"/>
+        </w:rPr>
+        <w:t>:</w:t>
+      </w:r>
+    </w:p>
+    <w:p>
+      <w:pPr>
+        <w:pStyle w:val="a7"/>
+        <w:numPr>
+          <w:ilvl w:val="0"/>
+          <w:numId w:val="12"/>
+        </w:numPr>
+        <w:ind w:left="851"/>
+      </w:pPr>
+      <w:r>
+        <w:t>«Дата сделки»</w:t>
+      </w:r>
+    </w:p>
+    <w:p>
+      <w:pPr>
+        <w:pStyle w:val="a7"/>
+        <w:numPr>
+          <w:ilvl w:val="0"/>
+          <w:numId w:val="12"/>
+        </w:numPr>
+        <w:ind w:left="851"/>
+      </w:pPr>
+      <w:r>
+        <w:lastRenderedPageBreak/>
+        <w:t>«Договор»</w:t>
+      </w:r>
+    </w:p>
+    <w:p>
+      <w:pPr>
+        <w:pStyle w:val="a7"/>
+        <w:numPr>
+          <w:ilvl w:val="0"/>
+          <w:numId w:val="12"/>
+        </w:numPr>
+        <w:ind w:left="851"/>
+      </w:pPr>
+      <w:r>
+        <w:t>«Стоимость»</w:t>
+      </w:r>
+    </w:p>
+    <w:p>
+      <w:pPr>
+        <w:pStyle w:val="a7"/>
+        <w:numPr>
+          <w:ilvl w:val="0"/>
+          <w:numId w:val="12"/>
+        </w:numPr>
+        <w:ind w:left="851"/>
+      </w:pPr>
+      <w:r>
+        <w:t>«Статус»</w:t>
+      </w:r>
+    </w:p>
+    <w:p>
+      <w:pPr>
+        <w:pStyle w:val="a7"/>
+        <w:numPr>
+          <w:ilvl w:val="0"/>
+          <w:numId w:val="12"/>
+        </w:numPr>
+        <w:ind w:left="851"/>
+      </w:pPr>
+      <w:r>
+        <w:t>«Предложение»</w:t>
+      </w:r>
+    </w:p>
+    <w:p>
+      <w:pPr>
+        <w:pStyle w:val="a7"/>
+        <w:numPr>
+          <w:ilvl w:val="0"/>
+          <w:numId w:val="12"/>
+        </w:numPr>
+        <w:ind w:left="851"/>
+      </w:pPr>
+      <w:r>
+        <w:t>«Владелец»</w:t>
+      </w:r>
+    </w:p>
+    <w:p>
+      <w:pPr>
+        <w:pStyle w:val="a7"/>
+        <w:numPr>
+          <w:ilvl w:val="0"/>
+          <w:numId w:val="12"/>
+        </w:numPr>
+        <w:ind w:left="851"/>
+      </w:pPr>
+      <w:r>
+        <w:t>«Риэлтор»</w:t>
+      </w:r>
+    </w:p>
+    <w:p>
+      <w:pPr>
+        <w:pStyle w:val="a7"/>
+        <w:numPr>
+          <w:ilvl w:val="0"/>
+          <w:numId w:val="12"/>
+        </w:numPr>
+        <w:ind w:left="851"/>
+      </w:pPr>
+      <w:r>
+        <w:t>«Владелец»</w:t>
+      </w:r>
+    </w:p>
+    <w:p>
+      <w:pPr>
+        <w:pStyle w:val="a7"/>
+        <w:numPr>
+          <w:ilvl w:val="0"/>
+          <w:numId w:val="12"/>
+        </w:numPr>
+        <w:ind w:left="851"/>
+      </w:pPr>
+      <w:r>
+        <w:t>«Покупатель»</w:t>
+      </w:r>
+    </w:p>
+    <w:p>
+      <w:pPr>
+        <w:pStyle w:val="a7"/>
+        <w:numPr>
+          <w:ilvl w:val="0"/>
+          <w:numId w:val="12"/>
+        </w:numPr>
+        <w:ind w:left="851"/>
+      </w:pPr>
+      <w:r>
+        <w:t>«Квартира»</w:t>
+      </w:r>
+    </w:p>
+    <w:p>
+      <w:pPr>
+        <w:pStyle w:val="a7"/>
+        <w:numPr>
+          <w:ilvl w:val="0"/>
+          <w:numId w:val="12"/>
+        </w:numPr>
+        <w:ind w:left="851"/>
+      </w:pPr>
+      <w:r>
+        <w:t>«Дом»</w:t>
+      </w:r>
+    </w:p>
+    <w:p>
+      <w:pPr>
+        <w:pStyle w:val="a7"/>
+        <w:numPr>
+          <w:ilvl w:val="0"/>
+          <w:numId w:val="12"/>
+        </w:numPr>
+        <w:ind w:left="851"/>
+      </w:pPr>
+      <w:r>
+        <w:t>«Улица»</w:t>
+      </w:r>
+    </w:p>
+    <w:p>
+      <w:pPr>
+        <w:pStyle w:val="a7"/>
+        <w:numPr>
+          <w:ilvl w:val="0"/>
+          <w:numId w:val="12"/>
+        </w:numPr>
+        <w:ind w:left="851"/>
+      </w:pPr>
+      <w:r>
+        <w:t>«Квартал»</w:t>
+      </w:r>
+    </w:p>
+    <w:p>
+      <w:pPr>
+        <w:ind w:firstLine="426"/>
+        <w:rPr>
+          <w:szCs w:val="28"/>
+        </w:rPr>
+      </w:pPr>
+      <w:r>
+        <w:t xml:space="preserve">Здесь этап инфологического проектирования завершается. </w:t>
+      </w:r>
+      <w:r>
+        <w:rPr>
+          <w:szCs w:val="28"/>
+        </w:rPr>
+        <w:t xml:space="preserve">После выбора модели данных и </w:t>
+      </w:r>
+      <w:r>
+        <w:rPr>
+          <w:szCs w:val="28"/>
+        </w:rPr>
+        <w:t>разработки</w:t>
+      </w:r>
+      <w:r>
+        <w:rPr>
+          <w:szCs w:val="28"/>
+        </w:rPr>
+        <w:t xml:space="preserve"> концептуальной модели можно переходить к следующему этапу – </w:t>
+      </w:r>
+      <w:proofErr w:type="spellStart"/>
+      <w:r>
+        <w:rPr>
+          <w:szCs w:val="28"/>
+        </w:rPr>
+        <w:t>даталогическому</w:t>
+      </w:r>
+      <w:proofErr w:type="spellEnd"/>
+      <w:r>
+        <w:rPr>
+          <w:szCs w:val="28"/>
+        </w:rPr>
+        <w:t xml:space="preserve"> проектированию.</w:t>
+      </w:r>
+    </w:p>
+    <w:p>
+      <w:pPr>
         <w:spacing w:after="160" w:line="278" w:lineRule="auto"/>
         <w:ind w:firstLine="0"/>
         <w:jc w:val="left"/>
@@ -23074,25 +24835,7 @@
                 <w:sz w:val="20"/>
                 <w:szCs w:val="20"/>
               </w:rPr>
-              <w:t>ORDER BY [</w:t>
-            </w:r>
-            <w:r>
-              <w:rPr>
-                <w:rFonts w:ascii="Cascadia Mono" w:hAnsi="Cascadia Mono" w:cs="Cascadia Mono"/>
-                <w:color w:val="000000" w:themeColor="text1"/>
-                <w:sz w:val="20"/>
-                <w:szCs w:val="20"/>
-              </w:rPr>
-              <w:t>Стоимость</w:t>
-            </w:r>
-            <w:r>
-              <w:rPr>
-                <w:rFonts w:ascii="Cascadia Mono" w:hAnsi="Cascadia Mono" w:cs="Cascadia Mono"/>
-                <w:color w:val="000000" w:themeColor="text1"/>
-                <w:sz w:val="20"/>
-                <w:szCs w:val="20"/>
-              </w:rPr>
-              <w:t>];</w:t>
+              <w:t>ORDER BY [Стоимость];</w:t>
             </w:r>
           </w:p>
         </w:tc>
@@ -25271,6 +27014,386 @@
       </w:pPr>
       <w:r>
         <w:t>Система добровольной сертификации услуг на рынке недвижимости Российской Федерации : зарегистрирована в Государственном реестре Госстандарта РФ 08.02.2002 г., рег. № РОСС RU.046.04 РН00 / Российская Гильдия Риэлторов. — Москва : РГР, 2002.</w:t>
+      </w:r>
+    </w:p>
+    <w:p>
+      <w:pPr>
+        <w:pStyle w:val="a7"/>
+        <w:numPr>
+          <w:ilvl w:val="0"/>
+          <w:numId w:val="1"/>
+        </w:numPr>
+        <w:spacing w:after="160" w:line="259" w:lineRule="auto"/>
+        <w:ind w:left="0" w:firstLine="426"/>
+        <w:rPr>
+          <w:szCs w:val="28"/>
+        </w:rPr>
+      </w:pPr>
+      <w:r>
+        <w:rPr>
+          <w:szCs w:val="28"/>
+        </w:rPr>
+        <w:t xml:space="preserve">Моделирование данных: что это и зачем нужно – </w:t>
+      </w:r>
+      <w:proofErr w:type="spellStart"/>
+      <w:r>
+        <w:rPr>
+          <w:szCs w:val="28"/>
+        </w:rPr>
+        <w:t>Яндекс.Практикум</w:t>
+      </w:r>
+      <w:proofErr w:type="spellEnd"/>
+      <w:r>
+        <w:rPr>
+          <w:szCs w:val="28"/>
+        </w:rPr>
+        <w:t xml:space="preserve"> [</w:t>
+      </w:r>
+      <w:proofErr w:type="spellStart"/>
+      <w:r>
+        <w:rPr>
+          <w:szCs w:val="28"/>
+        </w:rPr>
+        <w:t>электр.ресурс</w:t>
+      </w:r>
+      <w:proofErr w:type="spellEnd"/>
+      <w:r>
+        <w:rPr>
+          <w:szCs w:val="28"/>
+        </w:rPr>
+        <w:t xml:space="preserve">] https://practicum.yandex.ru/blog/chto-takoe-modelirovanie-dannyh-i-kak-ego-ispolzovat/. </w:t>
+      </w:r>
+      <w:r>
+        <w:rPr>
+          <w:color w:val="000000" w:themeColor="text1"/>
+          <w:szCs w:val="28"/>
+        </w:rPr>
+        <w:t xml:space="preserve">Дата обращения: </w:t>
+      </w:r>
+      <w:r>
+        <w:rPr>
+          <w:color w:val="000000" w:themeColor="text1"/>
+          <w:szCs w:val="28"/>
+        </w:rPr>
+        <w:t>15</w:t>
+      </w:r>
+      <w:r>
+        <w:rPr>
+          <w:color w:val="000000" w:themeColor="text1"/>
+          <w:szCs w:val="28"/>
+        </w:rPr>
+        <w:t>.0</w:t>
+      </w:r>
+      <w:r>
+        <w:rPr>
+          <w:color w:val="000000" w:themeColor="text1"/>
+          <w:szCs w:val="28"/>
+        </w:rPr>
+        <w:t>3</w:t>
+      </w:r>
+      <w:r>
+        <w:rPr>
+          <w:color w:val="000000" w:themeColor="text1"/>
+          <w:szCs w:val="28"/>
+        </w:rPr>
+        <w:t>.2025.</w:t>
+      </w:r>
+    </w:p>
+    <w:p>
+      <w:pPr>
+        <w:pStyle w:val="a7"/>
+        <w:numPr>
+          <w:ilvl w:val="0"/>
+          <w:numId w:val="1"/>
+        </w:numPr>
+        <w:spacing w:after="160" w:line="259" w:lineRule="auto"/>
+        <w:ind w:left="0" w:firstLine="426"/>
+        <w:rPr>
+          <w:szCs w:val="28"/>
+        </w:rPr>
+      </w:pPr>
+      <w:hyperlink r:id="rId13" w:anchor="85243" w:history="1">
+        <w:r>
+          <w:rPr>
+            <w:rStyle w:val="af2"/>
+            <w:szCs w:val="28"/>
+          </w:rPr>
+          <w:t>https://bstudy.net/991436/informatika/kontseptualnoe_infologicheskoe_proektirovanie#85243</w:t>
+        </w:r>
+      </w:hyperlink>
+    </w:p>
+    <w:p>
+      <w:pPr>
+        <w:pStyle w:val="a7"/>
+        <w:numPr>
+          <w:ilvl w:val="0"/>
+          <w:numId w:val="1"/>
+        </w:numPr>
+        <w:spacing w:after="160" w:line="259" w:lineRule="auto"/>
+        <w:ind w:left="0" w:firstLine="426"/>
+        <w:rPr>
+          <w:szCs w:val="28"/>
+        </w:rPr>
+      </w:pPr>
+      <w:hyperlink r:id="rId14" w:history="1">
+        <w:r>
+          <w:rPr>
+            <w:rStyle w:val="af2"/>
+            <w:szCs w:val="28"/>
+          </w:rPr>
+          <w:t>http://www.pv.sssu.ru/pluginfile.php/8825/mod_resource/content/1/1%20%D0%98%D0%9D%D0%A4%D0%9E%D0%9B%D0%9E%D0%93%D0%98%D0%A7%D0%95%D0%A1%D0%9A%D0%90%D0%AF%20%D0%9C%D0%9E%D0%94%D0%95%D0%9B%D0%AC%20%D0%94%D0%90%D0%9D%D0%9D%D0%AB%D0%A5.pdf</w:t>
+        </w:r>
+      </w:hyperlink>
+    </w:p>
+    <w:p>
+      <w:pPr>
+        <w:pStyle w:val="a7"/>
+        <w:numPr>
+          <w:ilvl w:val="0"/>
+          <w:numId w:val="1"/>
+        </w:numPr>
+        <w:spacing w:after="160" w:line="259" w:lineRule="auto"/>
+        <w:ind w:left="0" w:firstLine="426"/>
+        <w:rPr>
+          <w:szCs w:val="28"/>
+        </w:rPr>
+      </w:pPr>
+      <w:r>
+        <w:rPr>
+          <w:szCs w:val="28"/>
+        </w:rPr>
+        <w:t xml:space="preserve">Основные особенности систем, основанных на инвертированных списках – </w:t>
+      </w:r>
+      <w:proofErr w:type="spellStart"/>
+      <w:r>
+        <w:rPr>
+          <w:szCs w:val="28"/>
+          <w:lang w:val="en-US"/>
+        </w:rPr>
+        <w:t>CitForum</w:t>
+      </w:r>
+      <w:proofErr w:type="spellEnd"/>
+      <w:r>
+        <w:rPr>
+          <w:szCs w:val="28"/>
+        </w:rPr>
+        <w:t xml:space="preserve"> [</w:t>
+      </w:r>
+      <w:proofErr w:type="spellStart"/>
+      <w:r>
+        <w:rPr>
+          <w:szCs w:val="28"/>
+        </w:rPr>
+        <w:t>электр.ресурс</w:t>
+      </w:r>
+      <w:proofErr w:type="spellEnd"/>
+      <w:r>
+        <w:rPr>
+          <w:szCs w:val="28"/>
+        </w:rPr>
+        <w:t xml:space="preserve">] https://citforum.ru/database/osbd/glava_10.shtml. </w:t>
+      </w:r>
+      <w:r>
+        <w:rPr>
+          <w:color w:val="000000" w:themeColor="text1"/>
+          <w:szCs w:val="28"/>
+        </w:rPr>
+        <w:t xml:space="preserve">Дата обращения: </w:t>
+      </w:r>
+      <w:r>
+        <w:rPr>
+          <w:color w:val="000000" w:themeColor="text1"/>
+          <w:szCs w:val="28"/>
+        </w:rPr>
+        <w:t>15</w:t>
+      </w:r>
+      <w:r>
+        <w:rPr>
+          <w:color w:val="000000" w:themeColor="text1"/>
+          <w:szCs w:val="28"/>
+        </w:rPr>
+        <w:t>.0</w:t>
+      </w:r>
+      <w:r>
+        <w:rPr>
+          <w:color w:val="000000" w:themeColor="text1"/>
+          <w:szCs w:val="28"/>
+        </w:rPr>
+        <w:t>3</w:t>
+      </w:r>
+      <w:r>
+        <w:rPr>
+          <w:color w:val="000000" w:themeColor="text1"/>
+          <w:szCs w:val="28"/>
+        </w:rPr>
+        <w:t>.2025.</w:t>
+      </w:r>
+    </w:p>
+    <w:p>
+      <w:pPr>
+        <w:pStyle w:val="a7"/>
+        <w:numPr>
+          <w:ilvl w:val="0"/>
+          <w:numId w:val="1"/>
+        </w:numPr>
+        <w:spacing w:after="160" w:line="259" w:lineRule="auto"/>
+        <w:ind w:left="0" w:firstLine="426"/>
+        <w:rPr>
+          <w:szCs w:val="28"/>
+        </w:rPr>
+      </w:pPr>
+      <w:r>
+        <w:rPr>
+          <w:szCs w:val="28"/>
+        </w:rPr>
+        <w:t xml:space="preserve">Модель данных – что такое – </w:t>
+      </w:r>
+      <w:proofErr w:type="spellStart"/>
+      <w:r>
+        <w:rPr>
+          <w:szCs w:val="28"/>
+          <w:lang w:val="en-US"/>
+        </w:rPr>
+        <w:t>SkyEng</w:t>
+      </w:r>
+      <w:proofErr w:type="spellEnd"/>
+      <w:r>
+        <w:rPr>
+          <w:szCs w:val="28"/>
+        </w:rPr>
+        <w:t xml:space="preserve"> [</w:t>
+      </w:r>
+      <w:proofErr w:type="spellStart"/>
+      <w:r>
+        <w:rPr>
+          <w:szCs w:val="28"/>
+        </w:rPr>
+        <w:t>электр.ресурс</w:t>
+      </w:r>
+      <w:proofErr w:type="spellEnd"/>
+      <w:r>
+        <w:rPr>
+          <w:szCs w:val="28"/>
+        </w:rPr>
+        <w:t xml:space="preserve">] https://skyeng.ru/magazine/wiki/it-industriya/chto-takoe-model-dannykh/. </w:t>
+      </w:r>
+      <w:r>
+        <w:rPr>
+          <w:color w:val="000000" w:themeColor="text1"/>
+          <w:szCs w:val="28"/>
+        </w:rPr>
+        <w:t xml:space="preserve">Дата обращения: </w:t>
+      </w:r>
+      <w:r>
+        <w:rPr>
+          <w:color w:val="000000" w:themeColor="text1"/>
+          <w:szCs w:val="28"/>
+        </w:rPr>
+        <w:t>15</w:t>
+      </w:r>
+      <w:r>
+        <w:rPr>
+          <w:color w:val="000000" w:themeColor="text1"/>
+          <w:szCs w:val="28"/>
+        </w:rPr>
+        <w:t>.0</w:t>
+      </w:r>
+      <w:r>
+        <w:rPr>
+          <w:color w:val="000000" w:themeColor="text1"/>
+          <w:szCs w:val="28"/>
+        </w:rPr>
+        <w:t>3</w:t>
+      </w:r>
+      <w:r>
+        <w:rPr>
+          <w:color w:val="000000" w:themeColor="text1"/>
+          <w:szCs w:val="28"/>
+        </w:rPr>
+        <w:t>.2025.</w:t>
+      </w:r>
+    </w:p>
+    <w:p>
+      <w:pPr>
+        <w:pStyle w:val="a7"/>
+        <w:numPr>
+          <w:ilvl w:val="0"/>
+          <w:numId w:val="1"/>
+        </w:numPr>
+        <w:spacing w:after="160" w:line="259" w:lineRule="auto"/>
+        <w:ind w:left="0" w:firstLine="426"/>
+        <w:rPr>
+          <w:szCs w:val="28"/>
+        </w:rPr>
+      </w:pPr>
+      <w:r>
+        <w:rPr>
+          <w:szCs w:val="28"/>
+        </w:rPr>
+        <w:t xml:space="preserve">Сущности и связи: как и для чего системные аналитики создают ER‑диаграммы – </w:t>
+      </w:r>
+      <w:proofErr w:type="spellStart"/>
+      <w:r>
+        <w:rPr>
+          <w:szCs w:val="28"/>
+        </w:rPr>
+        <w:t>Яндекс.Практикум</w:t>
+      </w:r>
+      <w:proofErr w:type="spellEnd"/>
+      <w:r>
+        <w:rPr>
+          <w:szCs w:val="28"/>
+        </w:rPr>
+        <w:t xml:space="preserve"> [</w:t>
+      </w:r>
+      <w:proofErr w:type="spellStart"/>
+      <w:r>
+        <w:rPr>
+          <w:szCs w:val="28"/>
+        </w:rPr>
+        <w:t>электр.ресурс</w:t>
+      </w:r>
+      <w:proofErr w:type="spellEnd"/>
+      <w:r>
+        <w:rPr>
+          <w:szCs w:val="28"/>
+        </w:rPr>
+        <w:t xml:space="preserve">] https://practicum.yandex.ru/blog/chto-takoe-er-diagramma/. </w:t>
+      </w:r>
+      <w:r>
+        <w:rPr>
+          <w:color w:val="000000" w:themeColor="text1"/>
+          <w:szCs w:val="28"/>
+        </w:rPr>
+        <w:t xml:space="preserve">Дата обращения: </w:t>
+      </w:r>
+      <w:r>
+        <w:rPr>
+          <w:color w:val="000000" w:themeColor="text1"/>
+          <w:szCs w:val="28"/>
+        </w:rPr>
+        <w:t>08</w:t>
+      </w:r>
+      <w:r>
+        <w:rPr>
+          <w:color w:val="000000" w:themeColor="text1"/>
+          <w:szCs w:val="28"/>
+        </w:rPr>
+        <w:t>.0</w:t>
+      </w:r>
+      <w:r>
+        <w:rPr>
+          <w:color w:val="000000" w:themeColor="text1"/>
+          <w:szCs w:val="28"/>
+        </w:rPr>
+        <w:t>4</w:t>
+      </w:r>
+      <w:r>
+        <w:rPr>
+          <w:color w:val="000000" w:themeColor="text1"/>
+          <w:szCs w:val="28"/>
+        </w:rPr>
+        <w:t>.2025.</w:t>
       </w:r>
     </w:p>
     <w:p>
@@ -26578,7 +28701,7 @@
           <w14:ligatures w14:val="none"/>
         </w:rPr>
         <w:sectPr>
-          <w:headerReference w:type="default" r:id="rId8"/>
+          <w:headerReference w:type="default" r:id="rId15"/>
           <w:pgSz w:w="11906" w:h="16838"/>
           <w:pgMar w:top="1134" w:right="567" w:bottom="1134" w:left="1701" w:header="708" w:footer="708" w:gutter="0"/>
           <w:cols w:space="720"/>
@@ -32162,8 +34285,8 @@
       </w:pPr>
     </w:p>
     <w:sectPr>
-      <w:headerReference w:type="even" r:id="rId9"/>
-      <w:headerReference w:type="default" r:id="rId10"/>
+      <w:headerReference w:type="even" r:id="rId16"/>
+      <w:headerReference w:type="default" r:id="rId17"/>
       <w:pgSz w:w="11906" w:h="16838"/>
       <w:pgMar w:top="1134" w:right="567" w:bottom="1134" w:left="1701" w:header="720" w:footer="720" w:gutter="0"/>
       <w:cols w:space="720"/>
@@ -32175,7 +34298,7 @@
 </file>
 
 <file path=word/endnotes.xml><?xml version="1.0" encoding="utf-8"?>
-<w:endnotes xmlns:wpc="http://schemas.microsoft.com/office/word/2010/wordprocessingCanvas" xmlns:cx="http://schemas.microsoft.com/office/drawing/2014/chartex" xmlns:cx1="http://schemas.microsoft.com/office/drawing/2015/9/8/chartex" xmlns:cx2="http://schemas.microsoft.com/office/drawing/2015/10/21/chartex" xmlns:cx3="http://schemas.microsoft.com/office/drawing/2016/5/9/chartex" xmlns:cx4="http://schemas.microsoft.com/office/drawing/2016/5/10/chartex" xmlns:cx5="http://schemas.microsoft.com/office/drawing/2016/5/11/chartex" xmlns:cx6="http://schemas.microsoft.com/office/drawing/2016/5/12/chartex" xmlns:cx7="http://schemas.microsoft.com/office/drawing/2016/5/13/chartex" xmlns:cx8="http://schemas.microsoft.com/office/drawing/2016/5/14/chartex" xmlns:mc="http://schemas.openxmlformats.org/markup-compatibility/2006" xmlns:aink="http://schemas.microsoft.com/office/drawing/2016/ink" xmlns:am3d="http://schemas.microsoft.com/office/drawing/2017/model3d" xmlns:o="urn:schemas-microsoft-com:office:office" xmlns:oel="http://schemas.microsoft.com/office/2019/extlst" xmlns:r="http://schemas.openxmlformats.org/officeDocument/2006/relationships" xmlns:m="http://schemas.openxmlformats.org/officeDocument/2006/math" xmlns:v="urn:schemas-microsoft-com:vml" xmlns:wp14="http://schemas.microsoft.com/office/word/2010/wordprocessingDrawing" xmlns:wp="http://schemas.openxmlformats.org/drawingml/2006/wordprocessingDrawing" xmlns:w10="urn:schemas-microsoft-com:office:word" xmlns:w="http://schemas.openxmlformats.org/wordprocessingml/2006/main" xmlns:w14="http://schemas.microsoft.com/office/word/2010/wordml" xmlns:w15="http://schemas.microsoft.com/office/word/2012/wordml" xmlns:w16cex="http://schemas.microsoft.com/office/word/2018/wordml/cex" xmlns:w16cid="http://schemas.microsoft.com/office/word/2016/wordml/cid" xmlns:w16="http://schemas.microsoft.com/office/word/2018/wordml" xmlns:w16du="http://schemas.microsoft.com/office/word/2023/wordml/word16du" xmlns:w16sdtdh="http://schemas.microsoft.com/office/word/2020/wordml/sdtdatahash" xmlns:w16sdtfl="http://schemas.microsoft.com/office/word/2024/wordml/sdtformatlock" xmlns:w16se="http://schemas.microsoft.com/office/word/2015/wordml/symex" xmlns:wpg="http://schemas.microsoft.com/office/word/2010/wordprocessingGroup" xmlns:wpi="http://schemas.microsoft.com/office/word/2010/wordprocessingInk" xmlns:wne="http://schemas.microsoft.com/office/word/2006/wordml" xmlns:wps="http://schemas.microsoft.com/office/word/2010/wordprocessingShape" mc:Ignorable="w14 w15 w16se w16cid w16 w16cex w16sdtdh w16sdtfl w16du wp14">
+<w:endnotes xmlns:wpc="http://schemas.microsoft.com/office/word/2010/wordprocessingCanvas" xmlns:cx="http://schemas.microsoft.com/office/drawing/2014/chartex" xmlns:cx1="http://schemas.microsoft.com/office/drawing/2015/9/8/chartex" xmlns:cx2="http://schemas.microsoft.com/office/drawing/2015/10/21/chartex" xmlns:cx3="http://schemas.microsoft.com/office/drawing/2016/5/9/chartex" xmlns:cx4="http://schemas.microsoft.com/office/drawing/2016/5/10/chartex" xmlns:cx5="http://schemas.microsoft.com/office/drawing/2016/5/11/chartex" xmlns:cx6="http://schemas.microsoft.com/office/drawing/2016/5/12/chartex" xmlns:cx7="http://schemas.microsoft.com/office/drawing/2016/5/13/chartex" xmlns:cx8="http://schemas.microsoft.com/office/drawing/2016/5/14/chartex" xmlns:mc="http://schemas.openxmlformats.org/markup-compatibility/2006" xmlns:m="http://schemas.openxmlformats.org/officeDocument/2006/math" xmlns:aink="http://schemas.microsoft.com/office/drawing/2016/ink" xmlns:am3d="http://schemas.microsoft.com/office/drawing/2017/model3d" xmlns:oel="http://schemas.microsoft.com/office/2019/extlst" xmlns:r="http://schemas.openxmlformats.org/officeDocument/2006/relationships" xmlns:wp14="http://schemas.microsoft.com/office/word/2010/wordprocessingDrawing" xmlns:wp="http://schemas.openxmlformats.org/drawingml/2006/wordprocessingDrawing" xmlns:wpg="http://schemas.microsoft.com/office/word/2010/wordprocessingGroup" xmlns:wpi="http://schemas.microsoft.com/office/word/2010/wordprocessingInk" xmlns:wps="http://schemas.microsoft.com/office/word/2010/wordprocessingShape" xmlns:o="urn:schemas-microsoft-com:office:office" xmlns:v="urn:schemas-microsoft-com:vml" xmlns:w10="urn:schemas-microsoft-com:office:word" xmlns:w="http://schemas.openxmlformats.org/wordprocessingml/2006/main" xmlns:w14="http://schemas.microsoft.com/office/word/2010/wordml" xmlns:w15="http://schemas.microsoft.com/office/word/2012/wordml" xmlns:w16cex="http://schemas.microsoft.com/office/word/2018/wordml/cex" xmlns:w16cid="http://schemas.microsoft.com/office/word/2016/wordml/cid" xmlns:w16="http://schemas.microsoft.com/office/word/2018/wordml" xmlns:w16sdtdh="http://schemas.microsoft.com/office/word/2020/wordml/sdtdatahash" xmlns:w16sdtfl="http://schemas.microsoft.com/office/word/2024/wordml/sdtformatlock" xmlns:w16se="http://schemas.microsoft.com/office/word/2015/wordml/symex" xmlns:w16du="http://schemas.microsoft.com/office/word/2023/wordml/word16du" xmlns:wne="http://schemas.microsoft.com/office/word/2006/wordml" mc:Ignorable="w14 w15 w16se w16cid w16 w16cex w16sdtdh w16sdtfl w16du wp14">
   <w:endnote w:type="separator" w:id="-1">
     <w:p>
       <w:r>
@@ -32194,7 +34317,7 @@
 </file>
 
 <file path=word/footnotes.xml><?xml version="1.0" encoding="utf-8"?>
-<w:footnotes xmlns:wpc="http://schemas.microsoft.com/office/word/2010/wordprocessingCanvas" xmlns:cx="http://schemas.microsoft.com/office/drawing/2014/chartex" xmlns:cx1="http://schemas.microsoft.com/office/drawing/2015/9/8/chartex" xmlns:cx2="http://schemas.microsoft.com/office/drawing/2015/10/21/chartex" xmlns:cx3="http://schemas.microsoft.com/office/drawing/2016/5/9/chartex" xmlns:cx4="http://schemas.microsoft.com/office/drawing/2016/5/10/chartex" xmlns:cx5="http://schemas.microsoft.com/office/drawing/2016/5/11/chartex" xmlns:cx6="http://schemas.microsoft.com/office/drawing/2016/5/12/chartex" xmlns:cx7="http://schemas.microsoft.com/office/drawing/2016/5/13/chartex" xmlns:cx8="http://schemas.microsoft.com/office/drawing/2016/5/14/chartex" xmlns:mc="http://schemas.openxmlformats.org/markup-compatibility/2006" xmlns:aink="http://schemas.microsoft.com/office/drawing/2016/ink" xmlns:am3d="http://schemas.microsoft.com/office/drawing/2017/model3d" xmlns:o="urn:schemas-microsoft-com:office:office" xmlns:oel="http://schemas.microsoft.com/office/2019/extlst" xmlns:r="http://schemas.openxmlformats.org/officeDocument/2006/relationships" xmlns:m="http://schemas.openxmlformats.org/officeDocument/2006/math" xmlns:v="urn:schemas-microsoft-com:vml" xmlns:wp14="http://schemas.microsoft.com/office/word/2010/wordprocessingDrawing" xmlns:wp="http://schemas.openxmlformats.org/drawingml/2006/wordprocessingDrawing" xmlns:w10="urn:schemas-microsoft-com:office:word" xmlns:w="http://schemas.openxmlformats.org/wordprocessingml/2006/main" xmlns:w14="http://schemas.microsoft.com/office/word/2010/wordml" xmlns:w15="http://schemas.microsoft.com/office/word/2012/wordml" xmlns:w16cex="http://schemas.microsoft.com/office/word/2018/wordml/cex" xmlns:w16cid="http://schemas.microsoft.com/office/word/2016/wordml/cid" xmlns:w16="http://schemas.microsoft.com/office/word/2018/wordml" xmlns:w16du="http://schemas.microsoft.com/office/word/2023/wordml/word16du" xmlns:w16sdtdh="http://schemas.microsoft.com/office/word/2020/wordml/sdtdatahash" xmlns:w16sdtfl="http://schemas.microsoft.com/office/word/2024/wordml/sdtformatlock" xmlns:w16se="http://schemas.microsoft.com/office/word/2015/wordml/symex" xmlns:wpg="http://schemas.microsoft.com/office/word/2010/wordprocessingGroup" xmlns:wpi="http://schemas.microsoft.com/office/word/2010/wordprocessingInk" xmlns:wne="http://schemas.microsoft.com/office/word/2006/wordml" xmlns:wps="http://schemas.microsoft.com/office/word/2010/wordprocessingShape" mc:Ignorable="w14 w15 w16se w16cid w16 w16cex w16sdtdh w16sdtfl w16du wp14">
+<w:footnotes xmlns:wpc="http://schemas.microsoft.com/office/word/2010/wordprocessingCanvas" xmlns:cx="http://schemas.microsoft.com/office/drawing/2014/chartex" xmlns:cx1="http://schemas.microsoft.com/office/drawing/2015/9/8/chartex" xmlns:cx2="http://schemas.microsoft.com/office/drawing/2015/10/21/chartex" xmlns:cx3="http://schemas.microsoft.com/office/drawing/2016/5/9/chartex" xmlns:cx4="http://schemas.microsoft.com/office/drawing/2016/5/10/chartex" xmlns:cx5="http://schemas.microsoft.com/office/drawing/2016/5/11/chartex" xmlns:cx6="http://schemas.microsoft.com/office/drawing/2016/5/12/chartex" xmlns:cx7="http://schemas.microsoft.com/office/drawing/2016/5/13/chartex" xmlns:cx8="http://schemas.microsoft.com/office/drawing/2016/5/14/chartex" xmlns:mc="http://schemas.openxmlformats.org/markup-compatibility/2006" xmlns:m="http://schemas.openxmlformats.org/officeDocument/2006/math" xmlns:aink="http://schemas.microsoft.com/office/drawing/2016/ink" xmlns:am3d="http://schemas.microsoft.com/office/drawing/2017/model3d" xmlns:oel="http://schemas.microsoft.com/office/2019/extlst" xmlns:r="http://schemas.openxmlformats.org/officeDocument/2006/relationships" xmlns:wp14="http://schemas.microsoft.com/office/word/2010/wordprocessingDrawing" xmlns:wp="http://schemas.openxmlformats.org/drawingml/2006/wordprocessingDrawing" xmlns:wpg="http://schemas.microsoft.com/office/word/2010/wordprocessingGroup" xmlns:wpi="http://schemas.microsoft.com/office/word/2010/wordprocessingInk" xmlns:wps="http://schemas.microsoft.com/office/word/2010/wordprocessingShape" xmlns:o="urn:schemas-microsoft-com:office:office" xmlns:v="urn:schemas-microsoft-com:vml" xmlns:w10="urn:schemas-microsoft-com:office:word" xmlns:w="http://schemas.openxmlformats.org/wordprocessingml/2006/main" xmlns:w14="http://schemas.microsoft.com/office/word/2010/wordml" xmlns:w15="http://schemas.microsoft.com/office/word/2012/wordml" xmlns:w16cex="http://schemas.microsoft.com/office/word/2018/wordml/cex" xmlns:w16cid="http://schemas.microsoft.com/office/word/2016/wordml/cid" xmlns:w16="http://schemas.microsoft.com/office/word/2018/wordml" xmlns:w16sdtdh="http://schemas.microsoft.com/office/word/2020/wordml/sdtdatahash" xmlns:w16sdtfl="http://schemas.microsoft.com/office/word/2024/wordml/sdtformatlock" xmlns:w16se="http://schemas.microsoft.com/office/word/2015/wordml/symex" xmlns:w16du="http://schemas.microsoft.com/office/word/2023/wordml/word16du" xmlns:wne="http://schemas.microsoft.com/office/word/2006/wordml" mc:Ignorable="w14 w15 w16se w16cid w16 w16cex w16sdtdh w16sdtfl w16du wp14">
   <w:footnote w:type="separator" w:id="-1">
     <w:p>
       <w:r>
@@ -32213,7 +34336,7 @@
 </file>
 
 <file path=word/header1.xml><?xml version="1.0" encoding="utf-8"?>
-<w:hdr xmlns:wpc="http://schemas.microsoft.com/office/word/2010/wordprocessingCanvas" xmlns:cx="http://schemas.microsoft.com/office/drawing/2014/chartex" xmlns:cx1="http://schemas.microsoft.com/office/drawing/2015/9/8/chartex" xmlns:cx2="http://schemas.microsoft.com/office/drawing/2015/10/21/chartex" xmlns:cx3="http://schemas.microsoft.com/office/drawing/2016/5/9/chartex" xmlns:cx4="http://schemas.microsoft.com/office/drawing/2016/5/10/chartex" xmlns:cx5="http://schemas.microsoft.com/office/drawing/2016/5/11/chartex" xmlns:cx6="http://schemas.microsoft.com/office/drawing/2016/5/12/chartex" xmlns:cx7="http://schemas.microsoft.com/office/drawing/2016/5/13/chartex" xmlns:cx8="http://schemas.microsoft.com/office/drawing/2016/5/14/chartex" xmlns:mc="http://schemas.openxmlformats.org/markup-compatibility/2006" xmlns:aink="http://schemas.microsoft.com/office/drawing/2016/ink" xmlns:am3d="http://schemas.microsoft.com/office/drawing/2017/model3d" xmlns:o="urn:schemas-microsoft-com:office:office" xmlns:oel="http://schemas.microsoft.com/office/2019/extlst" xmlns:r="http://schemas.openxmlformats.org/officeDocument/2006/relationships" xmlns:m="http://schemas.openxmlformats.org/officeDocument/2006/math" xmlns:v="urn:schemas-microsoft-com:vml" xmlns:wp14="http://schemas.microsoft.com/office/word/2010/wordprocessingDrawing" xmlns:wp="http://schemas.openxmlformats.org/drawingml/2006/wordprocessingDrawing" xmlns:w10="urn:schemas-microsoft-com:office:word" xmlns:w="http://schemas.openxmlformats.org/wordprocessingml/2006/main" xmlns:w14="http://schemas.microsoft.com/office/word/2010/wordml" xmlns:w15="http://schemas.microsoft.com/office/word/2012/wordml" xmlns:w16cex="http://schemas.microsoft.com/office/word/2018/wordml/cex" xmlns:w16cid="http://schemas.microsoft.com/office/word/2016/wordml/cid" xmlns:w16="http://schemas.microsoft.com/office/word/2018/wordml" xmlns:w16du="http://schemas.microsoft.com/office/word/2023/wordml/word16du" xmlns:w16sdtdh="http://schemas.microsoft.com/office/word/2020/wordml/sdtdatahash" xmlns:w16sdtfl="http://schemas.microsoft.com/office/word/2024/wordml/sdtformatlock" xmlns:w16se="http://schemas.microsoft.com/office/word/2015/wordml/symex" xmlns:wpg="http://schemas.microsoft.com/office/word/2010/wordprocessingGroup" xmlns:wpi="http://schemas.microsoft.com/office/word/2010/wordprocessingInk" xmlns:wne="http://schemas.microsoft.com/office/word/2006/wordml" xmlns:wps="http://schemas.microsoft.com/office/word/2010/wordprocessingShape" mc:Ignorable="w14 w15 w16se w16cid w16 w16cex w16sdtdh w16sdtfl w16du wp14">
+<w:hdr xmlns:wpc="http://schemas.microsoft.com/office/word/2010/wordprocessingCanvas" xmlns:cx="http://schemas.microsoft.com/office/drawing/2014/chartex" xmlns:cx1="http://schemas.microsoft.com/office/drawing/2015/9/8/chartex" xmlns:cx2="http://schemas.microsoft.com/office/drawing/2015/10/21/chartex" xmlns:cx3="http://schemas.microsoft.com/office/drawing/2016/5/9/chartex" xmlns:cx4="http://schemas.microsoft.com/office/drawing/2016/5/10/chartex" xmlns:cx5="http://schemas.microsoft.com/office/drawing/2016/5/11/chartex" xmlns:cx6="http://schemas.microsoft.com/office/drawing/2016/5/12/chartex" xmlns:cx7="http://schemas.microsoft.com/office/drawing/2016/5/13/chartex" xmlns:cx8="http://schemas.microsoft.com/office/drawing/2016/5/14/chartex" xmlns:mc="http://schemas.openxmlformats.org/markup-compatibility/2006" xmlns:m="http://schemas.openxmlformats.org/officeDocument/2006/math" xmlns:aink="http://schemas.microsoft.com/office/drawing/2016/ink" xmlns:am3d="http://schemas.microsoft.com/office/drawing/2017/model3d" xmlns:oel="http://schemas.microsoft.com/office/2019/extlst" xmlns:r="http://schemas.openxmlformats.org/officeDocument/2006/relationships" xmlns:wp14="http://schemas.microsoft.com/office/word/2010/wordprocessingDrawing" xmlns:wp="http://schemas.openxmlformats.org/drawingml/2006/wordprocessingDrawing" xmlns:wpg="http://schemas.microsoft.com/office/word/2010/wordprocessingGroup" xmlns:wpi="http://schemas.microsoft.com/office/word/2010/wordprocessingInk" xmlns:wps="http://schemas.microsoft.com/office/word/2010/wordprocessingShape" xmlns:o="urn:schemas-microsoft-com:office:office" xmlns:v="urn:schemas-microsoft-com:vml" xmlns:w10="urn:schemas-microsoft-com:office:word" xmlns:w="http://schemas.openxmlformats.org/wordprocessingml/2006/main" xmlns:w14="http://schemas.microsoft.com/office/word/2010/wordml" xmlns:w15="http://schemas.microsoft.com/office/word/2012/wordml" xmlns:w16cex="http://schemas.microsoft.com/office/word/2018/wordml/cex" xmlns:w16cid="http://schemas.microsoft.com/office/word/2016/wordml/cid" xmlns:w16="http://schemas.microsoft.com/office/word/2018/wordml" xmlns:w16sdtdh="http://schemas.microsoft.com/office/word/2020/wordml/sdtdatahash" xmlns:w16sdtfl="http://schemas.microsoft.com/office/word/2024/wordml/sdtformatlock" xmlns:w16se="http://schemas.microsoft.com/office/word/2015/wordml/symex" xmlns:w16du="http://schemas.microsoft.com/office/word/2023/wordml/word16du" xmlns:wne="http://schemas.microsoft.com/office/word/2006/wordml" mc:Ignorable="w14 w15 w16se w16cid w16 w16cex w16sdtdh w16sdtfl w16du wp14">
   <w:sdt>
     <w:sdtPr>
       <w:id w:val="-1875757473"/>
@@ -32274,7 +34397,7 @@
 </file>
 
 <file path=word/header2.xml><?xml version="1.0" encoding="utf-8"?>
-<w:hdr xmlns:wpc="http://schemas.microsoft.com/office/word/2010/wordprocessingCanvas" xmlns:cx="http://schemas.microsoft.com/office/drawing/2014/chartex" xmlns:cx1="http://schemas.microsoft.com/office/drawing/2015/9/8/chartex" xmlns:cx2="http://schemas.microsoft.com/office/drawing/2015/10/21/chartex" xmlns:cx3="http://schemas.microsoft.com/office/drawing/2016/5/9/chartex" xmlns:cx4="http://schemas.microsoft.com/office/drawing/2016/5/10/chartex" xmlns:cx5="http://schemas.microsoft.com/office/drawing/2016/5/11/chartex" xmlns:cx6="http://schemas.microsoft.com/office/drawing/2016/5/12/chartex" xmlns:cx7="http://schemas.microsoft.com/office/drawing/2016/5/13/chartex" xmlns:cx8="http://schemas.microsoft.com/office/drawing/2016/5/14/chartex" xmlns:mc="http://schemas.openxmlformats.org/markup-compatibility/2006" xmlns:aink="http://schemas.microsoft.com/office/drawing/2016/ink" xmlns:am3d="http://schemas.microsoft.com/office/drawing/2017/model3d" xmlns:o="urn:schemas-microsoft-com:office:office" xmlns:oel="http://schemas.microsoft.com/office/2019/extlst" xmlns:r="http://schemas.openxmlformats.org/officeDocument/2006/relationships" xmlns:m="http://schemas.openxmlformats.org/officeDocument/2006/math" xmlns:v="urn:schemas-microsoft-com:vml" xmlns:wp14="http://schemas.microsoft.com/office/word/2010/wordprocessingDrawing" xmlns:wp="http://schemas.openxmlformats.org/drawingml/2006/wordprocessingDrawing" xmlns:w10="urn:schemas-microsoft-com:office:word" xmlns:w="http://schemas.openxmlformats.org/wordprocessingml/2006/main" xmlns:w14="http://schemas.microsoft.com/office/word/2010/wordml" xmlns:w15="http://schemas.microsoft.com/office/word/2012/wordml" xmlns:w16cex="http://schemas.microsoft.com/office/word/2018/wordml/cex" xmlns:w16cid="http://schemas.microsoft.com/office/word/2016/wordml/cid" xmlns:w16="http://schemas.microsoft.com/office/word/2018/wordml" xmlns:w16du="http://schemas.microsoft.com/office/word/2023/wordml/word16du" xmlns:w16sdtdh="http://schemas.microsoft.com/office/word/2020/wordml/sdtdatahash" xmlns:w16sdtfl="http://schemas.microsoft.com/office/word/2024/wordml/sdtformatlock" xmlns:w16se="http://schemas.microsoft.com/office/word/2015/wordml/symex" xmlns:wpg="http://schemas.microsoft.com/office/word/2010/wordprocessingGroup" xmlns:wpi="http://schemas.microsoft.com/office/word/2010/wordprocessingInk" xmlns:wne="http://schemas.microsoft.com/office/word/2006/wordml" xmlns:wps="http://schemas.microsoft.com/office/word/2010/wordprocessingShape" mc:Ignorable="w14 w15 w16se w16cid w16 w16cex w16sdtdh w16sdtfl w16du wp14">
+<w:hdr xmlns:wpc="http://schemas.microsoft.com/office/word/2010/wordprocessingCanvas" xmlns:cx="http://schemas.microsoft.com/office/drawing/2014/chartex" xmlns:cx1="http://schemas.microsoft.com/office/drawing/2015/9/8/chartex" xmlns:cx2="http://schemas.microsoft.com/office/drawing/2015/10/21/chartex" xmlns:cx3="http://schemas.microsoft.com/office/drawing/2016/5/9/chartex" xmlns:cx4="http://schemas.microsoft.com/office/drawing/2016/5/10/chartex" xmlns:cx5="http://schemas.microsoft.com/office/drawing/2016/5/11/chartex" xmlns:cx6="http://schemas.microsoft.com/office/drawing/2016/5/12/chartex" xmlns:cx7="http://schemas.microsoft.com/office/drawing/2016/5/13/chartex" xmlns:cx8="http://schemas.microsoft.com/office/drawing/2016/5/14/chartex" xmlns:mc="http://schemas.openxmlformats.org/markup-compatibility/2006" xmlns:m="http://schemas.openxmlformats.org/officeDocument/2006/math" xmlns:aink="http://schemas.microsoft.com/office/drawing/2016/ink" xmlns:am3d="http://schemas.microsoft.com/office/drawing/2017/model3d" xmlns:oel="http://schemas.microsoft.com/office/2019/extlst" xmlns:r="http://schemas.openxmlformats.org/officeDocument/2006/relationships" xmlns:wp14="http://schemas.microsoft.com/office/word/2010/wordprocessingDrawing" xmlns:wp="http://schemas.openxmlformats.org/drawingml/2006/wordprocessingDrawing" xmlns:wpg="http://schemas.microsoft.com/office/word/2010/wordprocessingGroup" xmlns:wpi="http://schemas.microsoft.com/office/word/2010/wordprocessingInk" xmlns:wps="http://schemas.microsoft.com/office/word/2010/wordprocessingShape" xmlns:o="urn:schemas-microsoft-com:office:office" xmlns:v="urn:schemas-microsoft-com:vml" xmlns:w10="urn:schemas-microsoft-com:office:word" xmlns:w="http://schemas.openxmlformats.org/wordprocessingml/2006/main" xmlns:w14="http://schemas.microsoft.com/office/word/2010/wordml" xmlns:w15="http://schemas.microsoft.com/office/word/2012/wordml" xmlns:w16cex="http://schemas.microsoft.com/office/word/2018/wordml/cex" xmlns:w16cid="http://schemas.microsoft.com/office/word/2016/wordml/cid" xmlns:w16="http://schemas.microsoft.com/office/word/2018/wordml" xmlns:w16sdtdh="http://schemas.microsoft.com/office/word/2020/wordml/sdtdatahash" xmlns:w16sdtfl="http://schemas.microsoft.com/office/word/2024/wordml/sdtformatlock" xmlns:w16se="http://schemas.microsoft.com/office/word/2015/wordml/symex" xmlns:w16du="http://schemas.microsoft.com/office/word/2023/wordml/word16du" xmlns:wne="http://schemas.microsoft.com/office/word/2006/wordml" mc:Ignorable="w14 w15 w16se w16cid w16 w16cex w16sdtdh w16sdtfl w16du wp14">
   <w:sdt>
     <w:sdtPr>
       <w:rPr>
@@ -32325,7 +34448,7 @@
 </file>
 
 <file path=word/header3.xml><?xml version="1.0" encoding="utf-8"?>
-<w:hdr xmlns:wpc="http://schemas.microsoft.com/office/word/2010/wordprocessingCanvas" xmlns:cx="http://schemas.microsoft.com/office/drawing/2014/chartex" xmlns:cx1="http://schemas.microsoft.com/office/drawing/2015/9/8/chartex" xmlns:cx2="http://schemas.microsoft.com/office/drawing/2015/10/21/chartex" xmlns:cx3="http://schemas.microsoft.com/office/drawing/2016/5/9/chartex" xmlns:cx4="http://schemas.microsoft.com/office/drawing/2016/5/10/chartex" xmlns:cx5="http://schemas.microsoft.com/office/drawing/2016/5/11/chartex" xmlns:cx6="http://schemas.microsoft.com/office/drawing/2016/5/12/chartex" xmlns:cx7="http://schemas.microsoft.com/office/drawing/2016/5/13/chartex" xmlns:cx8="http://schemas.microsoft.com/office/drawing/2016/5/14/chartex" xmlns:mc="http://schemas.openxmlformats.org/markup-compatibility/2006" xmlns:aink="http://schemas.microsoft.com/office/drawing/2016/ink" xmlns:am3d="http://schemas.microsoft.com/office/drawing/2017/model3d" xmlns:o="urn:schemas-microsoft-com:office:office" xmlns:oel="http://schemas.microsoft.com/office/2019/extlst" xmlns:r="http://schemas.openxmlformats.org/officeDocument/2006/relationships" xmlns:m="http://schemas.openxmlformats.org/officeDocument/2006/math" xmlns:v="urn:schemas-microsoft-com:vml" xmlns:wp14="http://schemas.microsoft.com/office/word/2010/wordprocessingDrawing" xmlns:wp="http://schemas.openxmlformats.org/drawingml/2006/wordprocessingDrawing" xmlns:w10="urn:schemas-microsoft-com:office:word" xmlns:w="http://schemas.openxmlformats.org/wordprocessingml/2006/main" xmlns:w14="http://schemas.microsoft.com/office/word/2010/wordml" xmlns:w15="http://schemas.microsoft.com/office/word/2012/wordml" xmlns:w16cex="http://schemas.microsoft.com/office/word/2018/wordml/cex" xmlns:w16cid="http://schemas.microsoft.com/office/word/2016/wordml/cid" xmlns:w16="http://schemas.microsoft.com/office/word/2018/wordml" xmlns:w16du="http://schemas.microsoft.com/office/word/2023/wordml/word16du" xmlns:w16sdtdh="http://schemas.microsoft.com/office/word/2020/wordml/sdtdatahash" xmlns:w16sdtfl="http://schemas.microsoft.com/office/word/2024/wordml/sdtformatlock" xmlns:w16se="http://schemas.microsoft.com/office/word/2015/wordml/symex" xmlns:wpg="http://schemas.microsoft.com/office/word/2010/wordprocessingGroup" xmlns:wpi="http://schemas.microsoft.com/office/word/2010/wordprocessingInk" xmlns:wne="http://schemas.microsoft.com/office/word/2006/wordml" xmlns:wps="http://schemas.microsoft.com/office/word/2010/wordprocessingShape" mc:Ignorable="w14 w15 w16se w16cid w16 w16cex w16sdtdh w16sdtfl w16du wp14">
+<w:hdr xmlns:wpc="http://schemas.microsoft.com/office/word/2010/wordprocessingCanvas" xmlns:cx="http://schemas.microsoft.com/office/drawing/2014/chartex" xmlns:cx1="http://schemas.microsoft.com/office/drawing/2015/9/8/chartex" xmlns:cx2="http://schemas.microsoft.com/office/drawing/2015/10/21/chartex" xmlns:cx3="http://schemas.microsoft.com/office/drawing/2016/5/9/chartex" xmlns:cx4="http://schemas.microsoft.com/office/drawing/2016/5/10/chartex" xmlns:cx5="http://schemas.microsoft.com/office/drawing/2016/5/11/chartex" xmlns:cx6="http://schemas.microsoft.com/office/drawing/2016/5/12/chartex" xmlns:cx7="http://schemas.microsoft.com/office/drawing/2016/5/13/chartex" xmlns:cx8="http://schemas.microsoft.com/office/drawing/2016/5/14/chartex" xmlns:mc="http://schemas.openxmlformats.org/markup-compatibility/2006" xmlns:m="http://schemas.openxmlformats.org/officeDocument/2006/math" xmlns:aink="http://schemas.microsoft.com/office/drawing/2016/ink" xmlns:am3d="http://schemas.microsoft.com/office/drawing/2017/model3d" xmlns:oel="http://schemas.microsoft.com/office/2019/extlst" xmlns:r="http://schemas.openxmlformats.org/officeDocument/2006/relationships" xmlns:wp14="http://schemas.microsoft.com/office/word/2010/wordprocessingDrawing" xmlns:wp="http://schemas.openxmlformats.org/drawingml/2006/wordprocessingDrawing" xmlns:wpg="http://schemas.microsoft.com/office/word/2010/wordprocessingGroup" xmlns:wpi="http://schemas.microsoft.com/office/word/2010/wordprocessingInk" xmlns:wps="http://schemas.microsoft.com/office/word/2010/wordprocessingShape" xmlns:o="urn:schemas-microsoft-com:office:office" xmlns:v="urn:schemas-microsoft-com:vml" xmlns:w10="urn:schemas-microsoft-com:office:word" xmlns:w="http://schemas.openxmlformats.org/wordprocessingml/2006/main" xmlns:w14="http://schemas.microsoft.com/office/word/2010/wordml" xmlns:w15="http://schemas.microsoft.com/office/word/2012/wordml" xmlns:w16cex="http://schemas.microsoft.com/office/word/2018/wordml/cex" xmlns:w16cid="http://schemas.microsoft.com/office/word/2016/wordml/cid" xmlns:w16="http://schemas.microsoft.com/office/word/2018/wordml" xmlns:w16sdtdh="http://schemas.microsoft.com/office/word/2020/wordml/sdtdatahash" xmlns:w16sdtfl="http://schemas.microsoft.com/office/word/2024/wordml/sdtformatlock" xmlns:w16se="http://schemas.microsoft.com/office/word/2015/wordml/symex" xmlns:w16du="http://schemas.microsoft.com/office/word/2023/wordml/word16du" xmlns:wne="http://schemas.microsoft.com/office/word/2006/wordml" mc:Ignorable="w14 w15 w16se w16cid w16 w16cex w16sdtdh w16sdtfl w16du wp14">
   <w:sdt>
     <w:sdtPr>
       <w:rPr>
@@ -32389,7 +34512,7 @@
 </file>
 
 <file path=word/numbering.xml><?xml version="1.0" encoding="utf-8"?>
-<w:numbering xmlns:wpc="http://schemas.microsoft.com/office/word/2010/wordprocessingCanvas" xmlns:cx="http://schemas.microsoft.com/office/drawing/2014/chartex" xmlns:cx1="http://schemas.microsoft.com/office/drawing/2015/9/8/chartex" xmlns:cx2="http://schemas.microsoft.com/office/drawing/2015/10/21/chartex" xmlns:cx3="http://schemas.microsoft.com/office/drawing/2016/5/9/chartex" xmlns:cx4="http://schemas.microsoft.com/office/drawing/2016/5/10/chartex" xmlns:cx5="http://schemas.microsoft.com/office/drawing/2016/5/11/chartex" xmlns:cx6="http://schemas.microsoft.com/office/drawing/2016/5/12/chartex" xmlns:cx7="http://schemas.microsoft.com/office/drawing/2016/5/13/chartex" xmlns:cx8="http://schemas.microsoft.com/office/drawing/2016/5/14/chartex" xmlns:mc="http://schemas.openxmlformats.org/markup-compatibility/2006" xmlns:aink="http://schemas.microsoft.com/office/drawing/2016/ink" xmlns:am3d="http://schemas.microsoft.com/office/drawing/2017/model3d" xmlns:o="urn:schemas-microsoft-com:office:office" xmlns:oel="http://schemas.microsoft.com/office/2019/extlst" xmlns:r="http://schemas.openxmlformats.org/officeDocument/2006/relationships" xmlns:m="http://schemas.openxmlformats.org/officeDocument/2006/math" xmlns:v="urn:schemas-microsoft-com:vml" xmlns:wp14="http://schemas.microsoft.com/office/word/2010/wordprocessingDrawing" xmlns:wp="http://schemas.openxmlformats.org/drawingml/2006/wordprocessingDrawing" xmlns:w10="urn:schemas-microsoft-com:office:word" xmlns:w="http://schemas.openxmlformats.org/wordprocessingml/2006/main" xmlns:w14="http://schemas.microsoft.com/office/word/2010/wordml" xmlns:w15="http://schemas.microsoft.com/office/word/2012/wordml" xmlns:w16cex="http://schemas.microsoft.com/office/word/2018/wordml/cex" xmlns:w16cid="http://schemas.microsoft.com/office/word/2016/wordml/cid" xmlns:w16="http://schemas.microsoft.com/office/word/2018/wordml" xmlns:w16du="http://schemas.microsoft.com/office/word/2023/wordml/word16du" xmlns:w16sdtdh="http://schemas.microsoft.com/office/word/2020/wordml/sdtdatahash" xmlns:w16sdtfl="http://schemas.microsoft.com/office/word/2024/wordml/sdtformatlock" xmlns:w16se="http://schemas.microsoft.com/office/word/2015/wordml/symex" xmlns:wpg="http://schemas.microsoft.com/office/word/2010/wordprocessingGroup" xmlns:wpi="http://schemas.microsoft.com/office/word/2010/wordprocessingInk" xmlns:wne="http://schemas.microsoft.com/office/word/2006/wordml" xmlns:wps="http://schemas.microsoft.com/office/word/2010/wordprocessingShape" mc:Ignorable="w14 w15 w16se w16cid w16 w16cex w16sdtdh w16sdtfl w16du wp14">
+<w:numbering xmlns:wpc="http://schemas.microsoft.com/office/word/2010/wordprocessingCanvas" xmlns:cx="http://schemas.microsoft.com/office/drawing/2014/chartex" xmlns:cx1="http://schemas.microsoft.com/office/drawing/2015/9/8/chartex" xmlns:cx2="http://schemas.microsoft.com/office/drawing/2015/10/21/chartex" xmlns:cx3="http://schemas.microsoft.com/office/drawing/2016/5/9/chartex" xmlns:cx4="http://schemas.microsoft.com/office/drawing/2016/5/10/chartex" xmlns:cx5="http://schemas.microsoft.com/office/drawing/2016/5/11/chartex" xmlns:cx6="http://schemas.microsoft.com/office/drawing/2016/5/12/chartex" xmlns:cx7="http://schemas.microsoft.com/office/drawing/2016/5/13/chartex" xmlns:cx8="http://schemas.microsoft.com/office/drawing/2016/5/14/chartex" xmlns:mc="http://schemas.openxmlformats.org/markup-compatibility/2006" xmlns:m="http://schemas.openxmlformats.org/officeDocument/2006/math" xmlns:aink="http://schemas.microsoft.com/office/drawing/2016/ink" xmlns:am3d="http://schemas.microsoft.com/office/drawing/2017/model3d" xmlns:oel="http://schemas.microsoft.com/office/2019/extlst" xmlns:r="http://schemas.openxmlformats.org/officeDocument/2006/relationships" xmlns:wp14="http://schemas.microsoft.com/office/word/2010/wordprocessingDrawing" xmlns:wp="http://schemas.openxmlformats.org/drawingml/2006/wordprocessingDrawing" xmlns:wpg="http://schemas.microsoft.com/office/word/2010/wordprocessingGroup" xmlns:wpi="http://schemas.microsoft.com/office/word/2010/wordprocessingInk" xmlns:wps="http://schemas.microsoft.com/office/word/2010/wordprocessingShape" xmlns:o="urn:schemas-microsoft-com:office:office" xmlns:v="urn:schemas-microsoft-com:vml" xmlns:w10="urn:schemas-microsoft-com:office:word" xmlns:w="http://schemas.openxmlformats.org/wordprocessingml/2006/main" xmlns:w14="http://schemas.microsoft.com/office/word/2010/wordml" xmlns:w15="http://schemas.microsoft.com/office/word/2012/wordml" xmlns:w16cex="http://schemas.microsoft.com/office/word/2018/wordml/cex" xmlns:w16cid="http://schemas.microsoft.com/office/word/2016/wordml/cid" xmlns:w16="http://schemas.microsoft.com/office/word/2018/wordml" xmlns:w16sdtdh="http://schemas.microsoft.com/office/word/2020/wordml/sdtdatahash" xmlns:w16sdtfl="http://schemas.microsoft.com/office/word/2024/wordml/sdtformatlock" xmlns:w16se="http://schemas.microsoft.com/office/word/2015/wordml/symex" xmlns:w16du="http://schemas.microsoft.com/office/word/2023/wordml/word16du" xmlns:wne="http://schemas.microsoft.com/office/word/2006/wordml" mc:Ignorable="w14 w15 w16se w16cid w16 w16cex w16sdtdh w16sdtfl w16du wp14">
   <w:abstractNum w:abstractNumId="0" w15:restartNumberingAfterBreak="0">
     <w:nsid w:val="00000002"/>
     <w:multiLevelType w:val="multilevel"/>
@@ -33112,16 +35235,16 @@
     </w:lvl>
   </w:abstractNum>
   <w:abstractNum w:abstractNumId="6" w15:restartNumberingAfterBreak="0">
-    <w:nsid w:val="5299712E"/>
+    <w:nsid w:val="267229CA"/>
     <w:multiLevelType w:val="hybridMultilevel"/>
-    <w:tmpl w:val="07C8C6E4"/>
+    <w:tmpl w:val="3C225834"/>
     <w:lvl w:ilvl="0" w:tplc="04190001">
       <w:start w:val="1"/>
       <w:numFmt w:val="bullet"/>
       <w:lvlText w:val=""/>
       <w:lvlJc w:val="left"/>
       <w:pPr>
-        <w:ind w:left="720" w:hanging="360"/>
+        <w:ind w:left="1146" w:hanging="360"/>
       </w:pPr>
       <w:rPr>
         <w:rFonts w:ascii="Symbol" w:hAnsi="Symbol" w:hint="default"/>
@@ -33133,7 +35256,7 @@
       <w:lvlText w:val="o"/>
       <w:lvlJc w:val="left"/>
       <w:pPr>
-        <w:ind w:left="1440" w:hanging="360"/>
+        <w:ind w:left="1866" w:hanging="360"/>
       </w:pPr>
       <w:rPr>
         <w:rFonts w:ascii="Courier New" w:hAnsi="Courier New" w:cs="Courier New" w:hint="default"/>
@@ -33145,7 +35268,7 @@
       <w:lvlText w:val=""/>
       <w:lvlJc w:val="left"/>
       <w:pPr>
-        <w:ind w:left="2160" w:hanging="360"/>
+        <w:ind w:left="2586" w:hanging="360"/>
       </w:pPr>
       <w:rPr>
         <w:rFonts w:ascii="Wingdings" w:hAnsi="Wingdings" w:hint="default"/>
@@ -33157,7 +35280,7 @@
       <w:lvlText w:val=""/>
       <w:lvlJc w:val="left"/>
       <w:pPr>
-        <w:ind w:left="2880" w:hanging="360"/>
+        <w:ind w:left="3306" w:hanging="360"/>
       </w:pPr>
       <w:rPr>
         <w:rFonts w:ascii="Symbol" w:hAnsi="Symbol" w:hint="default"/>
@@ -33169,7 +35292,7 @@
       <w:lvlText w:val="o"/>
       <w:lvlJc w:val="left"/>
       <w:pPr>
-        <w:ind w:left="3600" w:hanging="360"/>
+        <w:ind w:left="4026" w:hanging="360"/>
       </w:pPr>
       <w:rPr>
         <w:rFonts w:ascii="Courier New" w:hAnsi="Courier New" w:cs="Courier New" w:hint="default"/>
@@ -33181,7 +35304,7 @@
       <w:lvlText w:val=""/>
       <w:lvlJc w:val="left"/>
       <w:pPr>
-        <w:ind w:left="4320" w:hanging="360"/>
+        <w:ind w:left="4746" w:hanging="360"/>
       </w:pPr>
       <w:rPr>
         <w:rFonts w:ascii="Wingdings" w:hAnsi="Wingdings" w:hint="default"/>
@@ -33193,7 +35316,7 @@
       <w:lvlText w:val=""/>
       <w:lvlJc w:val="left"/>
       <w:pPr>
-        <w:ind w:left="5040" w:hanging="360"/>
+        <w:ind w:left="5466" w:hanging="360"/>
       </w:pPr>
       <w:rPr>
         <w:rFonts w:ascii="Symbol" w:hAnsi="Symbol" w:hint="default"/>
@@ -33205,7 +35328,7 @@
       <w:lvlText w:val="o"/>
       <w:lvlJc w:val="left"/>
       <w:pPr>
-        <w:ind w:left="5760" w:hanging="360"/>
+        <w:ind w:left="6186" w:hanging="360"/>
       </w:pPr>
       <w:rPr>
         <w:rFonts w:ascii="Courier New" w:hAnsi="Courier New" w:cs="Courier New" w:hint="default"/>
@@ -33217,7 +35340,7 @@
       <w:lvlText w:val=""/>
       <w:lvlJc w:val="left"/>
       <w:pPr>
-        <w:ind w:left="6480" w:hanging="360"/>
+        <w:ind w:left="6906" w:hanging="360"/>
       </w:pPr>
       <w:rPr>
         <w:rFonts w:ascii="Wingdings" w:hAnsi="Wingdings" w:hint="default"/>
@@ -33225,16 +35348,16 @@
     </w:lvl>
   </w:abstractNum>
   <w:abstractNum w:abstractNumId="7" w15:restartNumberingAfterBreak="0">
-    <w:nsid w:val="57B619A1"/>
+    <w:nsid w:val="48A7738C"/>
     <w:multiLevelType w:val="hybridMultilevel"/>
-    <w:tmpl w:val="DCF060FC"/>
+    <w:tmpl w:val="63C64298"/>
     <w:lvl w:ilvl="0" w:tplc="04190001">
       <w:start w:val="1"/>
       <w:numFmt w:val="bullet"/>
       <w:lvlText w:val=""/>
       <w:lvlJc w:val="left"/>
       <w:pPr>
-        <w:ind w:left="1080" w:hanging="360"/>
+        <w:ind w:left="1145" w:hanging="360"/>
       </w:pPr>
       <w:rPr>
         <w:rFonts w:ascii="Symbol" w:hAnsi="Symbol" w:hint="default"/>
@@ -33246,7 +35369,7 @@
       <w:lvlText w:val="o"/>
       <w:lvlJc w:val="left"/>
       <w:pPr>
-        <w:ind w:left="1800" w:hanging="360"/>
+        <w:ind w:left="1865" w:hanging="360"/>
       </w:pPr>
       <w:rPr>
         <w:rFonts w:ascii="Courier New" w:hAnsi="Courier New" w:cs="Courier New" w:hint="default"/>
@@ -33258,7 +35381,7 @@
       <w:lvlText w:val=""/>
       <w:lvlJc w:val="left"/>
       <w:pPr>
-        <w:ind w:left="2520" w:hanging="360"/>
+        <w:ind w:left="2585" w:hanging="360"/>
       </w:pPr>
       <w:rPr>
         <w:rFonts w:ascii="Wingdings" w:hAnsi="Wingdings" w:hint="default"/>
@@ -33270,7 +35393,7 @@
       <w:lvlText w:val=""/>
       <w:lvlJc w:val="left"/>
       <w:pPr>
-        <w:ind w:left="3240" w:hanging="360"/>
+        <w:ind w:left="3305" w:hanging="360"/>
       </w:pPr>
       <w:rPr>
         <w:rFonts w:ascii="Symbol" w:hAnsi="Symbol" w:hint="default"/>
@@ -33282,7 +35405,7 @@
       <w:lvlText w:val="o"/>
       <w:lvlJc w:val="left"/>
       <w:pPr>
-        <w:ind w:left="3960" w:hanging="360"/>
+        <w:ind w:left="4025" w:hanging="360"/>
       </w:pPr>
       <w:rPr>
         <w:rFonts w:ascii="Courier New" w:hAnsi="Courier New" w:cs="Courier New" w:hint="default"/>
@@ -33294,7 +35417,7 @@
       <w:lvlText w:val=""/>
       <w:lvlJc w:val="left"/>
       <w:pPr>
-        <w:ind w:left="4680" w:hanging="360"/>
+        <w:ind w:left="4745" w:hanging="360"/>
       </w:pPr>
       <w:rPr>
         <w:rFonts w:ascii="Wingdings" w:hAnsi="Wingdings" w:hint="default"/>
@@ -33306,7 +35429,7 @@
       <w:lvlText w:val=""/>
       <w:lvlJc w:val="left"/>
       <w:pPr>
-        <w:ind w:left="5400" w:hanging="360"/>
+        <w:ind w:left="5465" w:hanging="360"/>
       </w:pPr>
       <w:rPr>
         <w:rFonts w:ascii="Symbol" w:hAnsi="Symbol" w:hint="default"/>
@@ -33318,7 +35441,7 @@
       <w:lvlText w:val="o"/>
       <w:lvlJc w:val="left"/>
       <w:pPr>
-        <w:ind w:left="6120" w:hanging="360"/>
+        <w:ind w:left="6185" w:hanging="360"/>
       </w:pPr>
       <w:rPr>
         <w:rFonts w:ascii="Courier New" w:hAnsi="Courier New" w:cs="Courier New" w:hint="default"/>
@@ -33330,7 +35453,7 @@
       <w:lvlText w:val=""/>
       <w:lvlJc w:val="left"/>
       <w:pPr>
-        <w:ind w:left="6840" w:hanging="360"/>
+        <w:ind w:left="6905" w:hanging="360"/>
       </w:pPr>
       <w:rPr>
         <w:rFonts w:ascii="Wingdings" w:hAnsi="Wingdings" w:hint="default"/>
@@ -33338,9 +35461,9 @@
     </w:lvl>
   </w:abstractNum>
   <w:abstractNum w:abstractNumId="8" w15:restartNumberingAfterBreak="0">
-    <w:nsid w:val="74727B74"/>
+    <w:nsid w:val="5299712E"/>
     <w:multiLevelType w:val="hybridMultilevel"/>
-    <w:tmpl w:val="29EA74A6"/>
+    <w:tmpl w:val="07C8C6E4"/>
     <w:lvl w:ilvl="0" w:tplc="04190001">
       <w:start w:val="1"/>
       <w:numFmt w:val="bullet"/>
@@ -33451,6 +35574,232 @@
     </w:lvl>
   </w:abstractNum>
   <w:abstractNum w:abstractNumId="9" w15:restartNumberingAfterBreak="0">
+    <w:nsid w:val="57B619A1"/>
+    <w:multiLevelType w:val="hybridMultilevel"/>
+    <w:tmpl w:val="DCF060FC"/>
+    <w:lvl w:ilvl="0" w:tplc="04190001">
+      <w:start w:val="1"/>
+      <w:numFmt w:val="bullet"/>
+      <w:lvlText w:val=""/>
+      <w:lvlJc w:val="left"/>
+      <w:pPr>
+        <w:ind w:left="1080" w:hanging="360"/>
+      </w:pPr>
+      <w:rPr>
+        <w:rFonts w:ascii="Symbol" w:hAnsi="Symbol" w:hint="default"/>
+      </w:rPr>
+    </w:lvl>
+    <w:lvl w:ilvl="1" w:tplc="04190003" w:tentative="1">
+      <w:start w:val="1"/>
+      <w:numFmt w:val="bullet"/>
+      <w:lvlText w:val="o"/>
+      <w:lvlJc w:val="left"/>
+      <w:pPr>
+        <w:ind w:left="1800" w:hanging="360"/>
+      </w:pPr>
+      <w:rPr>
+        <w:rFonts w:ascii="Courier New" w:hAnsi="Courier New" w:cs="Courier New" w:hint="default"/>
+      </w:rPr>
+    </w:lvl>
+    <w:lvl w:ilvl="2" w:tplc="04190005" w:tentative="1">
+      <w:start w:val="1"/>
+      <w:numFmt w:val="bullet"/>
+      <w:lvlText w:val=""/>
+      <w:lvlJc w:val="left"/>
+      <w:pPr>
+        <w:ind w:left="2520" w:hanging="360"/>
+      </w:pPr>
+      <w:rPr>
+        <w:rFonts w:ascii="Wingdings" w:hAnsi="Wingdings" w:hint="default"/>
+      </w:rPr>
+    </w:lvl>
+    <w:lvl w:ilvl="3" w:tplc="04190001" w:tentative="1">
+      <w:start w:val="1"/>
+      <w:numFmt w:val="bullet"/>
+      <w:lvlText w:val=""/>
+      <w:lvlJc w:val="left"/>
+      <w:pPr>
+        <w:ind w:left="3240" w:hanging="360"/>
+      </w:pPr>
+      <w:rPr>
+        <w:rFonts w:ascii="Symbol" w:hAnsi="Symbol" w:hint="default"/>
+      </w:rPr>
+    </w:lvl>
+    <w:lvl w:ilvl="4" w:tplc="04190003" w:tentative="1">
+      <w:start w:val="1"/>
+      <w:numFmt w:val="bullet"/>
+      <w:lvlText w:val="o"/>
+      <w:lvlJc w:val="left"/>
+      <w:pPr>
+        <w:ind w:left="3960" w:hanging="360"/>
+      </w:pPr>
+      <w:rPr>
+        <w:rFonts w:ascii="Courier New" w:hAnsi="Courier New" w:cs="Courier New" w:hint="default"/>
+      </w:rPr>
+    </w:lvl>
+    <w:lvl w:ilvl="5" w:tplc="04190005" w:tentative="1">
+      <w:start w:val="1"/>
+      <w:numFmt w:val="bullet"/>
+      <w:lvlText w:val=""/>
+      <w:lvlJc w:val="left"/>
+      <w:pPr>
+        <w:ind w:left="4680" w:hanging="360"/>
+      </w:pPr>
+      <w:rPr>
+        <w:rFonts w:ascii="Wingdings" w:hAnsi="Wingdings" w:hint="default"/>
+      </w:rPr>
+    </w:lvl>
+    <w:lvl w:ilvl="6" w:tplc="04190001" w:tentative="1">
+      <w:start w:val="1"/>
+      <w:numFmt w:val="bullet"/>
+      <w:lvlText w:val=""/>
+      <w:lvlJc w:val="left"/>
+      <w:pPr>
+        <w:ind w:left="5400" w:hanging="360"/>
+      </w:pPr>
+      <w:rPr>
+        <w:rFonts w:ascii="Symbol" w:hAnsi="Symbol" w:hint="default"/>
+      </w:rPr>
+    </w:lvl>
+    <w:lvl w:ilvl="7" w:tplc="04190003" w:tentative="1">
+      <w:start w:val="1"/>
+      <w:numFmt w:val="bullet"/>
+      <w:lvlText w:val="o"/>
+      <w:lvlJc w:val="left"/>
+      <w:pPr>
+        <w:ind w:left="6120" w:hanging="360"/>
+      </w:pPr>
+      <w:rPr>
+        <w:rFonts w:ascii="Courier New" w:hAnsi="Courier New" w:cs="Courier New" w:hint="default"/>
+      </w:rPr>
+    </w:lvl>
+    <w:lvl w:ilvl="8" w:tplc="04190005" w:tentative="1">
+      <w:start w:val="1"/>
+      <w:numFmt w:val="bullet"/>
+      <w:lvlText w:val=""/>
+      <w:lvlJc w:val="left"/>
+      <w:pPr>
+        <w:ind w:left="6840" w:hanging="360"/>
+      </w:pPr>
+      <w:rPr>
+        <w:rFonts w:ascii="Wingdings" w:hAnsi="Wingdings" w:hint="default"/>
+      </w:rPr>
+    </w:lvl>
+  </w:abstractNum>
+  <w:abstractNum w:abstractNumId="10" w15:restartNumberingAfterBreak="0">
+    <w:nsid w:val="74727B74"/>
+    <w:multiLevelType w:val="hybridMultilevel"/>
+    <w:tmpl w:val="29EA74A6"/>
+    <w:lvl w:ilvl="0" w:tplc="04190001">
+      <w:start w:val="1"/>
+      <w:numFmt w:val="bullet"/>
+      <w:lvlText w:val=""/>
+      <w:lvlJc w:val="left"/>
+      <w:pPr>
+        <w:ind w:left="720" w:hanging="360"/>
+      </w:pPr>
+      <w:rPr>
+        <w:rFonts w:ascii="Symbol" w:hAnsi="Symbol" w:hint="default"/>
+      </w:rPr>
+    </w:lvl>
+    <w:lvl w:ilvl="1" w:tplc="04190003" w:tentative="1">
+      <w:start w:val="1"/>
+      <w:numFmt w:val="bullet"/>
+      <w:lvlText w:val="o"/>
+      <w:lvlJc w:val="left"/>
+      <w:pPr>
+        <w:ind w:left="1440" w:hanging="360"/>
+      </w:pPr>
+      <w:rPr>
+        <w:rFonts w:ascii="Courier New" w:hAnsi="Courier New" w:cs="Courier New" w:hint="default"/>
+      </w:rPr>
+    </w:lvl>
+    <w:lvl w:ilvl="2" w:tplc="04190005" w:tentative="1">
+      <w:start w:val="1"/>
+      <w:numFmt w:val="bullet"/>
+      <w:lvlText w:val=""/>
+      <w:lvlJc w:val="left"/>
+      <w:pPr>
+        <w:ind w:left="2160" w:hanging="360"/>
+      </w:pPr>
+      <w:rPr>
+        <w:rFonts w:ascii="Wingdings" w:hAnsi="Wingdings" w:hint="default"/>
+      </w:rPr>
+    </w:lvl>
+    <w:lvl w:ilvl="3" w:tplc="04190001" w:tentative="1">
+      <w:start w:val="1"/>
+      <w:numFmt w:val="bullet"/>
+      <w:lvlText w:val=""/>
+      <w:lvlJc w:val="left"/>
+      <w:pPr>
+        <w:ind w:left="2880" w:hanging="360"/>
+      </w:pPr>
+      <w:rPr>
+        <w:rFonts w:ascii="Symbol" w:hAnsi="Symbol" w:hint="default"/>
+      </w:rPr>
+    </w:lvl>
+    <w:lvl w:ilvl="4" w:tplc="04190003" w:tentative="1">
+      <w:start w:val="1"/>
+      <w:numFmt w:val="bullet"/>
+      <w:lvlText w:val="o"/>
+      <w:lvlJc w:val="left"/>
+      <w:pPr>
+        <w:ind w:left="3600" w:hanging="360"/>
+      </w:pPr>
+      <w:rPr>
+        <w:rFonts w:ascii="Courier New" w:hAnsi="Courier New" w:cs="Courier New" w:hint="default"/>
+      </w:rPr>
+    </w:lvl>
+    <w:lvl w:ilvl="5" w:tplc="04190005" w:tentative="1">
+      <w:start w:val="1"/>
+      <w:numFmt w:val="bullet"/>
+      <w:lvlText w:val=""/>
+      <w:lvlJc w:val="left"/>
+      <w:pPr>
+        <w:ind w:left="4320" w:hanging="360"/>
+      </w:pPr>
+      <w:rPr>
+        <w:rFonts w:ascii="Wingdings" w:hAnsi="Wingdings" w:hint="default"/>
+      </w:rPr>
+    </w:lvl>
+    <w:lvl w:ilvl="6" w:tplc="04190001" w:tentative="1">
+      <w:start w:val="1"/>
+      <w:numFmt w:val="bullet"/>
+      <w:lvlText w:val=""/>
+      <w:lvlJc w:val="left"/>
+      <w:pPr>
+        <w:ind w:left="5040" w:hanging="360"/>
+      </w:pPr>
+      <w:rPr>
+        <w:rFonts w:ascii="Symbol" w:hAnsi="Symbol" w:hint="default"/>
+      </w:rPr>
+    </w:lvl>
+    <w:lvl w:ilvl="7" w:tplc="04190003" w:tentative="1">
+      <w:start w:val="1"/>
+      <w:numFmt w:val="bullet"/>
+      <w:lvlText w:val="o"/>
+      <w:lvlJc w:val="left"/>
+      <w:pPr>
+        <w:ind w:left="5760" w:hanging="360"/>
+      </w:pPr>
+      <w:rPr>
+        <w:rFonts w:ascii="Courier New" w:hAnsi="Courier New" w:cs="Courier New" w:hint="default"/>
+      </w:rPr>
+    </w:lvl>
+    <w:lvl w:ilvl="8" w:tplc="04190005" w:tentative="1">
+      <w:start w:val="1"/>
+      <w:numFmt w:val="bullet"/>
+      <w:lvlText w:val=""/>
+      <w:lvlJc w:val="left"/>
+      <w:pPr>
+        <w:ind w:left="6480" w:hanging="360"/>
+      </w:pPr>
+      <w:rPr>
+        <w:rFonts w:ascii="Wingdings" w:hAnsi="Wingdings" w:hint="default"/>
+      </w:rPr>
+    </w:lvl>
+  </w:abstractNum>
+  <w:abstractNum w:abstractNumId="11" w15:restartNumberingAfterBreak="0">
     <w:nsid w:val="7FD44394"/>
     <w:multiLevelType w:val="multilevel"/>
     <w:tmpl w:val="AA06370E"/>
@@ -33585,7 +35934,7 @@
     <w:abstractNumId w:val="3"/>
   </w:num>
   <w:num w:numId="5" w16cid:durableId="1326740031">
-    <w:abstractNumId w:val="7"/>
+    <w:abstractNumId w:val="9"/>
   </w:num>
   <w:num w:numId="6" w16cid:durableId="2065714692">
     <w:abstractNumId w:val="5"/>
@@ -33594,19 +35943,25 @@
     <w:abstractNumId w:val="4"/>
   </w:num>
   <w:num w:numId="8" w16cid:durableId="956333174">
-    <w:abstractNumId w:val="9"/>
+    <w:abstractNumId w:val="11"/>
   </w:num>
   <w:num w:numId="9" w16cid:durableId="2036955382">
-    <w:abstractNumId w:val="6"/>
+    <w:abstractNumId w:val="8"/>
   </w:num>
   <w:num w:numId="10" w16cid:durableId="1034232859">
-    <w:abstractNumId w:val="8"/>
+    <w:abstractNumId w:val="10"/>
+  </w:num>
+  <w:num w:numId="11" w16cid:durableId="1256594658">
+    <w:abstractNumId w:val="7"/>
+  </w:num>
+  <w:num w:numId="12" w16cid:durableId="869341057">
+    <w:abstractNumId w:val="6"/>
   </w:num>
 </w:numbering>
 </file>
 
 <file path=word/styles.xml><?xml version="1.0" encoding="utf-8"?>
-<w:styles xmlns:mc="http://schemas.openxmlformats.org/markup-compatibility/2006" xmlns:r="http://schemas.openxmlformats.org/officeDocument/2006/relationships" xmlns:w="http://schemas.openxmlformats.org/wordprocessingml/2006/main" xmlns:w14="http://schemas.microsoft.com/office/word/2010/wordml" xmlns:w15="http://schemas.microsoft.com/office/word/2012/wordml" xmlns:w16cex="http://schemas.microsoft.com/office/word/2018/wordml/cex" xmlns:w16cid="http://schemas.microsoft.com/office/word/2016/wordml/cid" xmlns:w16="http://schemas.microsoft.com/office/word/2018/wordml" xmlns:w16du="http://schemas.microsoft.com/office/word/2023/wordml/word16du" xmlns:w16sdtdh="http://schemas.microsoft.com/office/word/2020/wordml/sdtdatahash" xmlns:w16sdtfl="http://schemas.microsoft.com/office/word/2024/wordml/sdtformatlock" xmlns:w16se="http://schemas.microsoft.com/office/word/2015/wordml/symex" mc:Ignorable="w14 w15 w16se w16cid w16 w16cex w16sdtdh w16sdtfl w16du">
+<w:styles xmlns:mc="http://schemas.openxmlformats.org/markup-compatibility/2006" xmlns:r="http://schemas.openxmlformats.org/officeDocument/2006/relationships" xmlns:w="http://schemas.openxmlformats.org/wordprocessingml/2006/main" xmlns:w14="http://schemas.microsoft.com/office/word/2010/wordml" xmlns:w15="http://schemas.microsoft.com/office/word/2012/wordml" xmlns:w16cex="http://schemas.microsoft.com/office/word/2018/wordml/cex" xmlns:w16cid="http://schemas.microsoft.com/office/word/2016/wordml/cid" xmlns:w16="http://schemas.microsoft.com/office/word/2018/wordml" xmlns:w16sdtdh="http://schemas.microsoft.com/office/word/2020/wordml/sdtdatahash" xmlns:w16sdtfl="http://schemas.microsoft.com/office/word/2024/wordml/sdtformatlock" xmlns:w16se="http://schemas.microsoft.com/office/word/2015/wordml/symex" xmlns:w16du="http://schemas.microsoft.com/office/word/2023/wordml/word16du" mc:Ignorable="w14 w15 w16se w16cid w16 w16cex w16sdtdh w16sdtfl w16du">
   <w:docDefaults>
     <w:rPrDefault>
       <w:rPr>
@@ -34005,7 +36360,7 @@
   <w:style w:type="paragraph" w:default="1" w:styleId="a">
     <w:name w:val="Normal"/>
     <w:qFormat/>
-    <w:rsid w:val="00395BB3"/>
+    <w:rsid w:val="000B5A2F"/>
     <w:pPr>
       <w:spacing w:after="0" w:line="240" w:lineRule="auto"/>
       <w:ind w:firstLine="425"/>
@@ -34859,6 +37214,35 @@
       <w:szCs w:val="16"/>
     </w:rPr>
   </w:style>
+  <w:style w:type="character" w:styleId="af7">
+    <w:name w:val="Unresolved Mention"/>
+    <w:basedOn w:val="a0"/>
+    <w:uiPriority w:val="99"/>
+    <w:semiHidden/>
+    <w:unhideWhenUsed/>
+    <w:rsid w:val="000B5A2F"/>
+    <w:rPr>
+      <w:color w:val="605E5C"/>
+      <w:shd w:val="clear" w:color="auto" w:fill="E1DFDD"/>
+    </w:rPr>
+  </w:style>
+  <w:style w:type="paragraph" w:styleId="af8">
+    <w:name w:val="caption"/>
+    <w:basedOn w:val="a"/>
+    <w:next w:val="a"/>
+    <w:uiPriority w:val="35"/>
+    <w:unhideWhenUsed/>
+    <w:qFormat/>
+    <w:rsid w:val="00E2009D"/>
+    <w:pPr>
+      <w:spacing w:after="200"/>
+      <w:jc w:val="center"/>
+    </w:pPr>
+    <w:rPr>
+      <w:iCs/>
+      <w:szCs w:val="18"/>
+    </w:rPr>
+  </w:style>
 </w:styles>
 </file>
 

</xml_diff>